<commit_message>
modified:   .gitignore 	modified:   Section-11.docx
</commit_message>
<xml_diff>
--- a/Section-11.docx
+++ b/Section-11.docx
@@ -5,16 +5,36 @@
     <w:p>
       <w:pPr>
         <w:pStyle w:val="Heading1"/>
-      </w:pPr>
-      <w:r>
+        <w:rPr>
+          <w:rFonts w:ascii="Cambria" w:hAnsi="Cambria"/>
+          <w:sz w:val="24"/>
+          <w:szCs w:val="24"/>
+        </w:rPr>
+      </w:pPr>
+      <w:r>
+        <w:rPr>
+          <w:rFonts w:ascii="Cambria" w:hAnsi="Cambria"/>
+          <w:sz w:val="24"/>
+          <w:szCs w:val="24"/>
+        </w:rPr>
         <w:t>MR CONDA</w:t>
       </w:r>
     </w:p>
     <w:p>
       <w:pPr>
         <w:pStyle w:val="Heading2"/>
-      </w:pPr>
-      <w:r>
+        <w:rPr>
+          <w:rFonts w:ascii="Cambria" w:hAnsi="Cambria"/>
+          <w:sz w:val="24"/>
+          <w:szCs w:val="24"/>
+        </w:rPr>
+      </w:pPr>
+      <w:r>
+        <w:rPr>
+          <w:rFonts w:ascii="Cambria" w:hAnsi="Cambria"/>
+          <w:sz w:val="24"/>
+          <w:szCs w:val="24"/>
+        </w:rPr>
         <w:t>What is Mr Conda?</w:t>
       </w:r>
     </w:p>
@@ -24,35 +44,64 @@
           <w:ilvl w:val="0"/>
           <w:numId w:val="28"/>
         </w:numPr>
-      </w:pPr>
-      <w:r>
-        <w:rPr>
+        <w:rPr>
+          <w:rFonts w:ascii="Cambria" w:hAnsi="Cambria"/>
+          <w:sz w:val="24"/>
+          <w:szCs w:val="24"/>
+        </w:rPr>
+      </w:pPr>
+      <w:r>
+        <w:rPr>
+          <w:rFonts w:ascii="Cambria" w:hAnsi="Cambria"/>
           <w:b/>
           <w:bCs/>
+          <w:sz w:val="24"/>
+          <w:szCs w:val="24"/>
         </w:rPr>
         <w:t>Mr Conda</w:t>
       </w:r>
       <w:r>
+        <w:rPr>
+          <w:rFonts w:ascii="Cambria" w:hAnsi="Cambria"/>
+          <w:sz w:val="24"/>
+          <w:szCs w:val="24"/>
+        </w:rPr>
         <w:t xml:space="preserve"> is a tool used to </w:t>
       </w:r>
       <w:r>
         <w:rPr>
+          <w:rFonts w:ascii="Cambria" w:hAnsi="Cambria"/>
           <w:b/>
           <w:bCs/>
+          <w:sz w:val="24"/>
+          <w:szCs w:val="24"/>
         </w:rPr>
         <w:t>install libraries</w:t>
       </w:r>
       <w:r>
+        <w:rPr>
+          <w:rFonts w:ascii="Cambria" w:hAnsi="Cambria"/>
+          <w:sz w:val="24"/>
+          <w:szCs w:val="24"/>
+        </w:rPr>
         <w:t xml:space="preserve"> and </w:t>
       </w:r>
       <w:r>
         <w:rPr>
+          <w:rFonts w:ascii="Cambria" w:hAnsi="Cambria"/>
           <w:b/>
           <w:bCs/>
+          <w:sz w:val="24"/>
+          <w:szCs w:val="24"/>
         </w:rPr>
         <w:t>create environments</w:t>
       </w:r>
       <w:r>
+        <w:rPr>
+          <w:rFonts w:ascii="Cambria" w:hAnsi="Cambria"/>
+          <w:sz w:val="24"/>
+          <w:szCs w:val="24"/>
+        </w:rPr>
         <w:t xml:space="preserve"> for machine learning projects.</w:t>
       </w:r>
     </w:p>
@@ -62,8 +111,18 @@
           <w:ilvl w:val="0"/>
           <w:numId w:val="28"/>
         </w:numPr>
-      </w:pPr>
-      <w:r>
+        <w:rPr>
+          <w:rFonts w:ascii="Cambria" w:hAnsi="Cambria"/>
+          <w:sz w:val="24"/>
+          <w:szCs w:val="24"/>
+        </w:rPr>
+      </w:pPr>
+      <w:r>
+        <w:rPr>
+          <w:rFonts w:ascii="Cambria" w:hAnsi="Cambria"/>
+          <w:sz w:val="24"/>
+          <w:szCs w:val="24"/>
+        </w:rPr>
         <w:t>It helps manage project dependencies easily.</w:t>
       </w:r>
     </w:p>
@@ -73,41 +132,89 @@
           <w:ilvl w:val="0"/>
           <w:numId w:val="28"/>
         </w:numPr>
-      </w:pPr>
-      <w:r>
+        <w:rPr>
+          <w:rFonts w:ascii="Cambria" w:hAnsi="Cambria"/>
+          <w:sz w:val="24"/>
+          <w:szCs w:val="24"/>
+        </w:rPr>
+      </w:pPr>
+      <w:r>
+        <w:rPr>
+          <w:rFonts w:ascii="Cambria" w:hAnsi="Cambria"/>
+          <w:sz w:val="24"/>
+          <w:szCs w:val="24"/>
+        </w:rPr>
         <w:t xml:space="preserve">It downloads required libraries </w:t>
       </w:r>
       <w:r>
         <w:rPr>
+          <w:rFonts w:ascii="Cambria" w:hAnsi="Cambria"/>
           <w:b/>
           <w:bCs/>
+          <w:sz w:val="24"/>
+          <w:szCs w:val="24"/>
         </w:rPr>
         <w:t>from the internet</w:t>
       </w:r>
       <w:r>
+        <w:rPr>
+          <w:rFonts w:ascii="Cambria" w:hAnsi="Cambria"/>
+          <w:sz w:val="24"/>
+          <w:szCs w:val="24"/>
+        </w:rPr>
         <w:t xml:space="preserve"> and adds them to your project.</w:t>
       </w:r>
     </w:p>
     <w:p>
       <w:pPr>
         <w:pStyle w:val="Heading1"/>
-      </w:pPr>
-      <w:r>
+        <w:rPr>
+          <w:rFonts w:ascii="Cambria" w:hAnsi="Cambria"/>
+          <w:sz w:val="24"/>
+          <w:szCs w:val="24"/>
+        </w:rPr>
+      </w:pPr>
+      <w:r>
+        <w:rPr>
+          <w:rFonts w:ascii="Cambria" w:hAnsi="Cambria"/>
+          <w:sz w:val="24"/>
+          <w:szCs w:val="24"/>
+        </w:rPr>
         <w:t>Machine Learning Project Overview</w:t>
       </w:r>
     </w:p>
     <w:p>
-      <w:r>
+      <w:pPr>
+        <w:rPr>
+          <w:rFonts w:ascii="Cambria" w:hAnsi="Cambria"/>
+          <w:sz w:val="24"/>
+          <w:szCs w:val="24"/>
+        </w:rPr>
+      </w:pPr>
+      <w:r>
+        <w:rPr>
+          <w:rFonts w:ascii="Cambria" w:hAnsi="Cambria"/>
+          <w:sz w:val="24"/>
+          <w:szCs w:val="24"/>
+        </w:rPr>
         <w:t xml:space="preserve">A machine learning project usually has </w:t>
       </w:r>
       <w:r>
         <w:rPr>
+          <w:rFonts w:ascii="Cambria" w:hAnsi="Cambria"/>
           <w:b/>
           <w:bCs/>
+          <w:sz w:val="24"/>
+          <w:szCs w:val="24"/>
         </w:rPr>
         <w:t>two main parts</w:t>
       </w:r>
       <w:r>
+        <w:rPr>
+          <w:rFonts w:ascii="Cambria" w:hAnsi="Cambria"/>
+          <w:sz w:val="24"/>
+          <w:szCs w:val="24"/>
+        </w:rPr>
         <w:t>:</w:t>
       </w:r>
     </w:p>
@@ -117,11 +224,19 @@
           <w:ilvl w:val="0"/>
           <w:numId w:val="29"/>
         </w:numPr>
-      </w:pPr>
-      <w:r>
-        <w:rPr>
+        <w:rPr>
+          <w:rFonts w:ascii="Cambria" w:hAnsi="Cambria"/>
+          <w:sz w:val="24"/>
+          <w:szCs w:val="24"/>
+        </w:rPr>
+      </w:pPr>
+      <w:r>
+        <w:rPr>
+          <w:rFonts w:ascii="Cambria" w:hAnsi="Cambria"/>
           <w:b/>
           <w:bCs/>
+          <w:sz w:val="24"/>
+          <w:szCs w:val="24"/>
         </w:rPr>
         <w:t>Data Analysis</w:t>
       </w:r>
@@ -132,8 +247,20 @@
           <w:ilvl w:val="1"/>
           <w:numId w:val="29"/>
         </w:numPr>
-      </w:pPr>
-      <w:r>
+        <w:ind w:left="1434" w:hanging="357"/>
+        <w:contextualSpacing/>
+        <w:rPr>
+          <w:rFonts w:ascii="Cambria" w:hAnsi="Cambria"/>
+          <w:sz w:val="24"/>
+          <w:szCs w:val="24"/>
+        </w:rPr>
+      </w:pPr>
+      <w:r>
+        <w:rPr>
+          <w:rFonts w:ascii="Cambria" w:hAnsi="Cambria"/>
+          <w:sz w:val="24"/>
+          <w:szCs w:val="24"/>
+        </w:rPr>
         <w:t>Understanding data</w:t>
       </w:r>
     </w:p>
@@ -143,8 +270,20 @@
           <w:ilvl w:val="1"/>
           <w:numId w:val="29"/>
         </w:numPr>
-      </w:pPr>
-      <w:r>
+        <w:ind w:left="1434" w:hanging="357"/>
+        <w:contextualSpacing/>
+        <w:rPr>
+          <w:rFonts w:ascii="Cambria" w:hAnsi="Cambria"/>
+          <w:sz w:val="24"/>
+          <w:szCs w:val="24"/>
+        </w:rPr>
+      </w:pPr>
+      <w:r>
+        <w:rPr>
+          <w:rFonts w:ascii="Cambria" w:hAnsi="Cambria"/>
+          <w:sz w:val="24"/>
+          <w:szCs w:val="24"/>
+        </w:rPr>
         <w:t>Cleaning data</w:t>
       </w:r>
     </w:p>
@@ -154,8 +293,20 @@
           <w:ilvl w:val="1"/>
           <w:numId w:val="29"/>
         </w:numPr>
-      </w:pPr>
-      <w:r>
+        <w:ind w:left="1434" w:hanging="357"/>
+        <w:contextualSpacing/>
+        <w:rPr>
+          <w:rFonts w:ascii="Cambria" w:hAnsi="Cambria"/>
+          <w:sz w:val="24"/>
+          <w:szCs w:val="24"/>
+        </w:rPr>
+      </w:pPr>
+      <w:r>
+        <w:rPr>
+          <w:rFonts w:ascii="Cambria" w:hAnsi="Cambria"/>
+          <w:sz w:val="24"/>
+          <w:szCs w:val="24"/>
+        </w:rPr>
         <w:t>Visualizing data</w:t>
       </w:r>
     </w:p>
@@ -165,11 +316,19 @@
           <w:ilvl w:val="0"/>
           <w:numId w:val="29"/>
         </w:numPr>
-      </w:pPr>
-      <w:r>
-        <w:rPr>
+        <w:rPr>
+          <w:rFonts w:ascii="Cambria" w:hAnsi="Cambria"/>
+          <w:sz w:val="24"/>
+          <w:szCs w:val="24"/>
+        </w:rPr>
+      </w:pPr>
+      <w:r>
+        <w:rPr>
+          <w:rFonts w:ascii="Cambria" w:hAnsi="Cambria"/>
           <w:b/>
           <w:bCs/>
+          <w:sz w:val="24"/>
+          <w:szCs w:val="24"/>
         </w:rPr>
         <w:t>Machine Learning</w:t>
       </w:r>
@@ -180,8 +339,18 @@
           <w:ilvl w:val="1"/>
           <w:numId w:val="29"/>
         </w:numPr>
-      </w:pPr>
-      <w:r>
+        <w:rPr>
+          <w:rFonts w:ascii="Cambria" w:hAnsi="Cambria"/>
+          <w:sz w:val="24"/>
+          <w:szCs w:val="24"/>
+        </w:rPr>
+      </w:pPr>
+      <w:r>
+        <w:rPr>
+          <w:rFonts w:ascii="Cambria" w:hAnsi="Cambria"/>
+          <w:sz w:val="24"/>
+          <w:szCs w:val="24"/>
+        </w:rPr>
         <w:t>Training models</w:t>
       </w:r>
     </w:p>
@@ -191,8 +360,18 @@
           <w:ilvl w:val="1"/>
           <w:numId w:val="29"/>
         </w:numPr>
-      </w:pPr>
-      <w:r>
+        <w:rPr>
+          <w:rFonts w:ascii="Cambria" w:hAnsi="Cambria"/>
+          <w:sz w:val="24"/>
+          <w:szCs w:val="24"/>
+        </w:rPr>
+      </w:pPr>
+      <w:r>
+        <w:rPr>
+          <w:rFonts w:ascii="Cambria" w:hAnsi="Cambria"/>
+          <w:sz w:val="24"/>
+          <w:szCs w:val="24"/>
+        </w:rPr>
         <w:t>Testing models</w:t>
       </w:r>
     </w:p>
@@ -202,24 +381,54 @@
           <w:ilvl w:val="1"/>
           <w:numId w:val="29"/>
         </w:numPr>
-      </w:pPr>
-      <w:r>
+        <w:rPr>
+          <w:rFonts w:ascii="Cambria" w:hAnsi="Cambria"/>
+          <w:sz w:val="24"/>
+          <w:szCs w:val="24"/>
+        </w:rPr>
+      </w:pPr>
+      <w:r>
+        <w:rPr>
+          <w:rFonts w:ascii="Cambria" w:hAnsi="Cambria"/>
+          <w:sz w:val="24"/>
+          <w:szCs w:val="24"/>
+        </w:rPr>
         <w:t>Making predictions</w:t>
       </w:r>
     </w:p>
     <w:p>
       <w:pPr>
         <w:pStyle w:val="Heading1"/>
-      </w:pPr>
-      <w:r>
+        <w:rPr>
+          <w:rFonts w:ascii="Cambria" w:hAnsi="Cambria"/>
+          <w:sz w:val="24"/>
+          <w:szCs w:val="24"/>
+        </w:rPr>
+      </w:pPr>
+      <w:r>
+        <w:rPr>
+          <w:rFonts w:ascii="Cambria" w:hAnsi="Cambria"/>
+          <w:sz w:val="24"/>
+          <w:szCs w:val="24"/>
+        </w:rPr>
         <w:t>Tools for Data Science Environment</w:t>
       </w:r>
     </w:p>
     <w:p>
       <w:pPr>
         <w:pStyle w:val="Heading2"/>
-      </w:pPr>
-      <w:r>
+        <w:rPr>
+          <w:rFonts w:ascii="Cambria" w:hAnsi="Cambria"/>
+          <w:sz w:val="24"/>
+          <w:szCs w:val="24"/>
+        </w:rPr>
+      </w:pPr>
+      <w:r>
+        <w:rPr>
+          <w:rFonts w:ascii="Cambria" w:hAnsi="Cambria"/>
+          <w:sz w:val="24"/>
+          <w:szCs w:val="24"/>
+        </w:rPr>
         <w:t>Anaconda</w:t>
       </w:r>
     </w:p>
@@ -229,8 +438,18 @@
           <w:ilvl w:val="0"/>
           <w:numId w:val="30"/>
         </w:numPr>
-      </w:pPr>
-      <w:r>
+        <w:rPr>
+          <w:rFonts w:ascii="Cambria" w:hAnsi="Cambria"/>
+          <w:sz w:val="24"/>
+          <w:szCs w:val="24"/>
+        </w:rPr>
+      </w:pPr>
+      <w:r>
+        <w:rPr>
+          <w:rFonts w:ascii="Cambria" w:hAnsi="Cambria"/>
+          <w:sz w:val="24"/>
+          <w:szCs w:val="24"/>
+        </w:rPr>
         <w:t>A complete data science environment</w:t>
       </w:r>
     </w:p>
@@ -240,8 +459,18 @@
           <w:ilvl w:val="0"/>
           <w:numId w:val="30"/>
         </w:numPr>
-      </w:pPr>
-      <w:r>
+        <w:rPr>
+          <w:rFonts w:ascii="Cambria" w:hAnsi="Cambria"/>
+          <w:sz w:val="24"/>
+          <w:szCs w:val="24"/>
+        </w:rPr>
+      </w:pPr>
+      <w:r>
+        <w:rPr>
+          <w:rFonts w:ascii="Cambria" w:hAnsi="Cambria"/>
+          <w:sz w:val="24"/>
+          <w:szCs w:val="24"/>
+        </w:rPr>
         <w:t>Comes with many pre-installed libraries</w:t>
       </w:r>
     </w:p>
@@ -251,8 +480,18 @@
           <w:ilvl w:val="0"/>
           <w:numId w:val="30"/>
         </w:numPr>
-      </w:pPr>
-      <w:r>
+        <w:rPr>
+          <w:rFonts w:ascii="Cambria" w:hAnsi="Cambria"/>
+          <w:sz w:val="24"/>
+          <w:szCs w:val="24"/>
+        </w:rPr>
+      </w:pPr>
+      <w:r>
+        <w:rPr>
+          <w:rFonts w:ascii="Cambria" w:hAnsi="Cambria"/>
+          <w:sz w:val="24"/>
+          <w:szCs w:val="24"/>
+        </w:rPr>
         <w:t>Easy to use for beginners</w:t>
       </w:r>
     </w:p>
@@ -262,36 +501,72 @@
           <w:ilvl w:val="0"/>
           <w:numId w:val="30"/>
         </w:numPr>
-      </w:pPr>
-      <w:r>
+        <w:rPr>
+          <w:rFonts w:ascii="Cambria" w:hAnsi="Cambria"/>
+          <w:sz w:val="24"/>
+          <w:szCs w:val="24"/>
+        </w:rPr>
+      </w:pPr>
+      <w:r>
+        <w:rPr>
+          <w:rFonts w:ascii="Cambria" w:hAnsi="Cambria"/>
+          <w:sz w:val="24"/>
+          <w:szCs w:val="24"/>
+        </w:rPr>
         <w:t xml:space="preserve"> Takes </w:t>
       </w:r>
       <w:r>
         <w:rPr>
+          <w:rFonts w:ascii="Cambria" w:hAnsi="Cambria"/>
           <w:b/>
           <w:bCs/>
+          <w:sz w:val="24"/>
+          <w:szCs w:val="24"/>
         </w:rPr>
         <w:t>a lot of storage</w:t>
       </w:r>
       <w:r>
+        <w:rPr>
+          <w:rFonts w:ascii="Cambria" w:hAnsi="Cambria"/>
+          <w:sz w:val="24"/>
+          <w:szCs w:val="24"/>
+        </w:rPr>
         <w:t xml:space="preserve"> (around </w:t>
       </w:r>
       <w:r>
         <w:rPr>
+          <w:rFonts w:ascii="Cambria" w:hAnsi="Cambria"/>
           <w:b/>
           <w:bCs/>
+          <w:sz w:val="24"/>
+          <w:szCs w:val="24"/>
         </w:rPr>
         <w:t>3 GB</w:t>
       </w:r>
       <w:r>
+        <w:rPr>
+          <w:rFonts w:ascii="Cambria" w:hAnsi="Cambria"/>
+          <w:sz w:val="24"/>
+          <w:szCs w:val="24"/>
+        </w:rPr>
         <w:t>)</w:t>
       </w:r>
     </w:p>
     <w:p>
       <w:pPr>
         <w:pStyle w:val="Heading2"/>
-      </w:pPr>
-      <w:r>
+        <w:rPr>
+          <w:rFonts w:ascii="Cambria" w:hAnsi="Cambria"/>
+          <w:sz w:val="24"/>
+          <w:szCs w:val="24"/>
+        </w:rPr>
+      </w:pPr>
+      <w:r>
+        <w:rPr>
+          <w:rFonts w:ascii="Cambria" w:hAnsi="Cambria"/>
+          <w:sz w:val="24"/>
+          <w:szCs w:val="24"/>
+        </w:rPr>
         <w:t>Miniconda</w:t>
       </w:r>
     </w:p>
@@ -301,8 +576,18 @@
           <w:ilvl w:val="0"/>
           <w:numId w:val="31"/>
         </w:numPr>
-      </w:pPr>
-      <w:r>
+        <w:rPr>
+          <w:rFonts w:ascii="Cambria" w:hAnsi="Cambria"/>
+          <w:sz w:val="24"/>
+          <w:szCs w:val="24"/>
+        </w:rPr>
+      </w:pPr>
+      <w:r>
+        <w:rPr>
+          <w:rFonts w:ascii="Cambria" w:hAnsi="Cambria"/>
+          <w:sz w:val="24"/>
+          <w:szCs w:val="24"/>
+        </w:rPr>
         <w:t>A lightweight version of Anaconda</w:t>
       </w:r>
     </w:p>
@@ -312,8 +597,18 @@
           <w:ilvl w:val="0"/>
           <w:numId w:val="31"/>
         </w:numPr>
-      </w:pPr>
-      <w:r>
+        <w:rPr>
+          <w:rFonts w:ascii="Cambria" w:hAnsi="Cambria"/>
+          <w:sz w:val="24"/>
+          <w:szCs w:val="24"/>
+        </w:rPr>
+      </w:pPr>
+      <w:r>
+        <w:rPr>
+          <w:rFonts w:ascii="Cambria" w:hAnsi="Cambria"/>
+          <w:sz w:val="24"/>
+          <w:szCs w:val="24"/>
+        </w:rPr>
         <w:t>Only includes basic tools</w:t>
       </w:r>
     </w:p>
@@ -323,28 +618,54 @@
           <w:ilvl w:val="0"/>
           <w:numId w:val="31"/>
         </w:numPr>
-      </w:pPr>
-      <w:r>
+        <w:rPr>
+          <w:rFonts w:ascii="Cambria" w:hAnsi="Cambria"/>
+          <w:sz w:val="24"/>
+          <w:szCs w:val="24"/>
+        </w:rPr>
+      </w:pPr>
+      <w:r>
+        <w:rPr>
+          <w:rFonts w:ascii="Cambria" w:hAnsi="Cambria"/>
+          <w:sz w:val="24"/>
+          <w:szCs w:val="24"/>
+        </w:rPr>
         <w:t xml:space="preserve">Takes </w:t>
       </w:r>
       <w:r>
         <w:rPr>
+          <w:rFonts w:ascii="Cambria" w:hAnsi="Cambria"/>
           <w:b/>
           <w:bCs/>
+          <w:sz w:val="24"/>
+          <w:szCs w:val="24"/>
         </w:rPr>
         <w:t>very less storage</w:t>
       </w:r>
       <w:r>
+        <w:rPr>
+          <w:rFonts w:ascii="Cambria" w:hAnsi="Cambria"/>
+          <w:sz w:val="24"/>
+          <w:szCs w:val="24"/>
+        </w:rPr>
         <w:t xml:space="preserve"> (around </w:t>
       </w:r>
       <w:r>
         <w:rPr>
+          <w:rFonts w:ascii="Cambria" w:hAnsi="Cambria"/>
           <w:b/>
           <w:bCs/>
+          <w:sz w:val="24"/>
+          <w:szCs w:val="24"/>
         </w:rPr>
         <w:t>200 MB</w:t>
       </w:r>
       <w:r>
+        <w:rPr>
+          <w:rFonts w:ascii="Cambria" w:hAnsi="Cambria"/>
+          <w:sz w:val="24"/>
+          <w:szCs w:val="24"/>
+        </w:rPr>
         <w:t>)</w:t>
       </w:r>
     </w:p>
@@ -354,14 +675,27 @@
           <w:ilvl w:val="0"/>
           <w:numId w:val="31"/>
         </w:numPr>
-      </w:pPr>
-      <w:r>
+        <w:rPr>
+          <w:rFonts w:ascii="Cambria" w:hAnsi="Cambria"/>
+          <w:sz w:val="24"/>
+          <w:szCs w:val="24"/>
+        </w:rPr>
+      </w:pPr>
+      <w:r>
+        <w:rPr>
+          <w:rFonts w:ascii="Cambria" w:hAnsi="Cambria"/>
+          <w:sz w:val="24"/>
+          <w:szCs w:val="24"/>
+        </w:rPr>
         <w:t xml:space="preserve">Libraries are installed </w:t>
       </w:r>
       <w:r>
         <w:rPr>
+          <w:rFonts w:ascii="Cambria" w:hAnsi="Cambria"/>
           <w:b/>
           <w:bCs/>
+          <w:sz w:val="24"/>
+          <w:szCs w:val="24"/>
         </w:rPr>
         <w:t>only when needed</w:t>
       </w:r>
@@ -369,8 +703,19 @@
     <w:p>
       <w:pPr>
         <w:pStyle w:val="Heading2"/>
-      </w:pPr>
-      <w:r>
+        <w:rPr>
+          <w:rFonts w:ascii="Cambria" w:hAnsi="Cambria"/>
+          <w:sz w:val="24"/>
+          <w:szCs w:val="24"/>
+        </w:rPr>
+      </w:pPr>
+      <w:r>
+        <w:rPr>
+          <w:rFonts w:ascii="Cambria" w:hAnsi="Cambria"/>
+          <w:sz w:val="24"/>
+          <w:szCs w:val="24"/>
+        </w:rPr>
+        <w:lastRenderedPageBreak/>
         <w:t>Mr Conda</w:t>
       </w:r>
     </w:p>
@@ -380,20 +725,48 @@
           <w:ilvl w:val="0"/>
           <w:numId w:val="32"/>
         </w:numPr>
-      </w:pPr>
-      <w:r>
+        <w:rPr>
+          <w:rFonts w:ascii="Cambria" w:hAnsi="Cambria"/>
+          <w:sz w:val="24"/>
+          <w:szCs w:val="24"/>
+        </w:rPr>
+      </w:pPr>
+      <w:r>
+        <w:rPr>
+          <w:rFonts w:ascii="Cambria" w:hAnsi="Cambria"/>
+          <w:sz w:val="24"/>
+          <w:szCs w:val="24"/>
+        </w:rPr>
         <w:t xml:space="preserve">Works as a </w:t>
       </w:r>
       <w:r>
         <w:rPr>
+          <w:rFonts w:ascii="Cambria" w:hAnsi="Cambria"/>
           <w:b/>
           <w:bCs/>
+          <w:sz w:val="24"/>
+          <w:szCs w:val="24"/>
         </w:rPr>
         <w:t>helper tool</w:t>
       </w:r>
       <w:r>
-        <w:t xml:space="preserve"> for Miniconda</w:t>
-      </w:r>
+        <w:rPr>
+          <w:rFonts w:ascii="Cambria" w:hAnsi="Cambria"/>
+          <w:sz w:val="24"/>
+          <w:szCs w:val="24"/>
+        </w:rPr>
+        <w:t xml:space="preserve"> for </w:t>
+      </w:r>
+      <w:proofErr w:type="spellStart"/>
+      <w:r>
+        <w:rPr>
+          <w:rFonts w:ascii="Cambria" w:hAnsi="Cambria"/>
+          <w:sz w:val="24"/>
+          <w:szCs w:val="24"/>
+        </w:rPr>
+        <w:t>Miniconda</w:t>
+      </w:r>
+      <w:proofErr w:type="spellEnd"/>
     </w:p>
     <w:p>
       <w:pPr>
@@ -401,9 +774,18 @@
           <w:ilvl w:val="0"/>
           <w:numId w:val="32"/>
         </w:numPr>
-      </w:pPr>
-      <w:r>
-        <w:lastRenderedPageBreak/>
+        <w:rPr>
+          <w:rFonts w:ascii="Cambria" w:hAnsi="Cambria"/>
+          <w:sz w:val="24"/>
+          <w:szCs w:val="24"/>
+        </w:rPr>
+      </w:pPr>
+      <w:r>
+        <w:rPr>
+          <w:rFonts w:ascii="Cambria" w:hAnsi="Cambria"/>
+          <w:sz w:val="24"/>
+          <w:szCs w:val="24"/>
+        </w:rPr>
         <w:t>Makes environment and library management easier</w:t>
       </w:r>
     </w:p>
@@ -413,14 +795,27 @@
           <w:ilvl w:val="0"/>
           <w:numId w:val="32"/>
         </w:numPr>
-      </w:pPr>
-      <w:r>
+        <w:rPr>
+          <w:rFonts w:ascii="Cambria" w:hAnsi="Cambria"/>
+          <w:sz w:val="24"/>
+          <w:szCs w:val="24"/>
+        </w:rPr>
+      </w:pPr>
+      <w:r>
+        <w:rPr>
+          <w:rFonts w:ascii="Cambria" w:hAnsi="Cambria"/>
+          <w:sz w:val="24"/>
+          <w:szCs w:val="24"/>
+        </w:rPr>
         <w:t xml:space="preserve">Preferred for </w:t>
       </w:r>
       <w:r>
         <w:rPr>
+          <w:rFonts w:ascii="Cambria" w:hAnsi="Cambria"/>
           <w:b/>
           <w:bCs/>
+          <w:sz w:val="24"/>
+          <w:szCs w:val="24"/>
         </w:rPr>
         <w:t>machine learning projects</w:t>
       </w:r>
@@ -428,13 +823,35 @@
     <w:p>
       <w:pPr>
         <w:pStyle w:val="Heading1"/>
-      </w:pPr>
-      <w:r>
+        <w:rPr>
+          <w:rFonts w:ascii="Cambria" w:hAnsi="Cambria"/>
+          <w:sz w:val="24"/>
+          <w:szCs w:val="24"/>
+        </w:rPr>
+      </w:pPr>
+      <w:r>
+        <w:rPr>
+          <w:rFonts w:ascii="Cambria" w:hAnsi="Cambria"/>
+          <w:sz w:val="24"/>
+          <w:szCs w:val="24"/>
+        </w:rPr>
         <w:t>Setting Up a Machine Learning Project</w:t>
       </w:r>
     </w:p>
     <w:p>
-      <w:r>
+      <w:pPr>
+        <w:rPr>
+          <w:rFonts w:ascii="Cambria" w:hAnsi="Cambria"/>
+          <w:sz w:val="24"/>
+          <w:szCs w:val="24"/>
+        </w:rPr>
+      </w:pPr>
+      <w:r>
+        <w:rPr>
+          <w:rFonts w:ascii="Cambria" w:hAnsi="Cambria"/>
+          <w:sz w:val="24"/>
+          <w:szCs w:val="24"/>
+        </w:rPr>
         <w:t>Basic steps:</w:t>
       </w:r>
     </w:p>
@@ -444,17 +861,32 @@
           <w:ilvl w:val="0"/>
           <w:numId w:val="33"/>
         </w:numPr>
-      </w:pPr>
-      <w:r>
+        <w:rPr>
+          <w:rFonts w:ascii="Cambria" w:hAnsi="Cambria"/>
+          <w:sz w:val="24"/>
+          <w:szCs w:val="24"/>
+        </w:rPr>
+      </w:pPr>
+      <w:r>
+        <w:rPr>
+          <w:rFonts w:ascii="Cambria" w:hAnsi="Cambria"/>
+          <w:sz w:val="24"/>
+          <w:szCs w:val="24"/>
+        </w:rPr>
         <w:t xml:space="preserve">Install </w:t>
       </w:r>
-      <w:r>
-        <w:rPr>
+      <w:proofErr w:type="spellStart"/>
+      <w:r>
+        <w:rPr>
+          <w:rFonts w:ascii="Cambria" w:hAnsi="Cambria"/>
           <w:b/>
           <w:bCs/>
+          <w:sz w:val="24"/>
+          <w:szCs w:val="24"/>
         </w:rPr>
         <w:t>Miniconda</w:t>
       </w:r>
+      <w:proofErr w:type="spellEnd"/>
     </w:p>
     <w:p>
       <w:pPr>
@@ -462,18 +894,36 @@
           <w:ilvl w:val="0"/>
           <w:numId w:val="33"/>
         </w:numPr>
-      </w:pPr>
-      <w:r>
+        <w:rPr>
+          <w:rFonts w:ascii="Cambria" w:hAnsi="Cambria"/>
+          <w:sz w:val="24"/>
+          <w:szCs w:val="24"/>
+        </w:rPr>
+      </w:pPr>
+      <w:r>
+        <w:rPr>
+          <w:rFonts w:ascii="Cambria" w:hAnsi="Cambria"/>
+          <w:sz w:val="24"/>
+          <w:szCs w:val="24"/>
+        </w:rPr>
         <w:t xml:space="preserve">Use </w:t>
       </w:r>
       <w:r>
         <w:rPr>
+          <w:rFonts w:ascii="Cambria" w:hAnsi="Cambria"/>
           <w:b/>
           <w:bCs/>
+          <w:sz w:val="24"/>
+          <w:szCs w:val="24"/>
         </w:rPr>
         <w:t>Mr Conda</w:t>
       </w:r>
       <w:r>
+        <w:rPr>
+          <w:rFonts w:ascii="Cambria" w:hAnsi="Cambria"/>
+          <w:sz w:val="24"/>
+          <w:szCs w:val="24"/>
+        </w:rPr>
         <w:t xml:space="preserve"> to create an environment</w:t>
       </w:r>
     </w:p>
@@ -483,8 +933,18 @@
           <w:ilvl w:val="0"/>
           <w:numId w:val="33"/>
         </w:numPr>
-      </w:pPr>
-      <w:r>
+        <w:rPr>
+          <w:rFonts w:ascii="Cambria" w:hAnsi="Cambria"/>
+          <w:sz w:val="24"/>
+          <w:szCs w:val="24"/>
+        </w:rPr>
+      </w:pPr>
+      <w:r>
+        <w:rPr>
+          <w:rFonts w:ascii="Cambria" w:hAnsi="Cambria"/>
+          <w:sz w:val="24"/>
+          <w:szCs w:val="24"/>
+        </w:rPr>
         <w:t>Install required libraries (NumPy, Pandas, Scikit-learn, etc.)</w:t>
       </w:r>
     </w:p>
@@ -494,8 +954,18 @@
           <w:ilvl w:val="0"/>
           <w:numId w:val="33"/>
         </w:numPr>
-      </w:pPr>
-      <w:r>
+        <w:rPr>
+          <w:rFonts w:ascii="Cambria" w:hAnsi="Cambria"/>
+          <w:sz w:val="24"/>
+          <w:szCs w:val="24"/>
+        </w:rPr>
+      </w:pPr>
+      <w:r>
+        <w:rPr>
+          <w:rFonts w:ascii="Cambria" w:hAnsi="Cambria"/>
+          <w:sz w:val="24"/>
+          <w:szCs w:val="24"/>
+        </w:rPr>
         <w:t>Start data analysis</w:t>
       </w:r>
     </w:p>
@@ -505,16 +975,36 @@
           <w:ilvl w:val="0"/>
           <w:numId w:val="33"/>
         </w:numPr>
-      </w:pPr>
-      <w:r>
+        <w:rPr>
+          <w:rFonts w:ascii="Cambria" w:hAnsi="Cambria"/>
+          <w:sz w:val="24"/>
+          <w:szCs w:val="24"/>
+        </w:rPr>
+      </w:pPr>
+      <w:r>
+        <w:rPr>
+          <w:rFonts w:ascii="Cambria" w:hAnsi="Cambria"/>
+          <w:sz w:val="24"/>
+          <w:szCs w:val="24"/>
+        </w:rPr>
         <w:t>Train machine learning models</w:t>
       </w:r>
     </w:p>
     <w:p>
       <w:pPr>
         <w:pStyle w:val="Heading1"/>
-      </w:pPr>
-      <w:r>
+        <w:rPr>
+          <w:rFonts w:ascii="Cambria" w:hAnsi="Cambria"/>
+          <w:sz w:val="24"/>
+          <w:szCs w:val="24"/>
+        </w:rPr>
+      </w:pPr>
+      <w:r>
+        <w:rPr>
+          <w:rFonts w:ascii="Cambria" w:hAnsi="Cambria"/>
+          <w:sz w:val="24"/>
+          <w:szCs w:val="24"/>
+        </w:rPr>
         <w:t>Blueprint of a Machine Learning Project</w:t>
       </w:r>
     </w:p>
@@ -524,8 +1014,18 @@
           <w:ilvl w:val="0"/>
           <w:numId w:val="34"/>
         </w:numPr>
-      </w:pPr>
-      <w:r>
+        <w:rPr>
+          <w:rFonts w:ascii="Cambria" w:hAnsi="Cambria"/>
+          <w:sz w:val="24"/>
+          <w:szCs w:val="24"/>
+        </w:rPr>
+      </w:pPr>
+      <w:r>
+        <w:rPr>
+          <w:rFonts w:ascii="Cambria" w:hAnsi="Cambria"/>
+          <w:sz w:val="24"/>
+          <w:szCs w:val="24"/>
+        </w:rPr>
         <w:t>Problem Definition</w:t>
       </w:r>
     </w:p>
@@ -535,8 +1035,18 @@
           <w:ilvl w:val="0"/>
           <w:numId w:val="34"/>
         </w:numPr>
-      </w:pPr>
-      <w:r>
+        <w:rPr>
+          <w:rFonts w:ascii="Cambria" w:hAnsi="Cambria"/>
+          <w:sz w:val="24"/>
+          <w:szCs w:val="24"/>
+        </w:rPr>
+      </w:pPr>
+      <w:r>
+        <w:rPr>
+          <w:rFonts w:ascii="Cambria" w:hAnsi="Cambria"/>
+          <w:sz w:val="24"/>
+          <w:szCs w:val="24"/>
+        </w:rPr>
         <w:t>Data Collection</w:t>
       </w:r>
     </w:p>
@@ -546,8 +1056,18 @@
           <w:ilvl w:val="0"/>
           <w:numId w:val="34"/>
         </w:numPr>
-      </w:pPr>
-      <w:r>
+        <w:rPr>
+          <w:rFonts w:ascii="Cambria" w:hAnsi="Cambria"/>
+          <w:sz w:val="24"/>
+          <w:szCs w:val="24"/>
+        </w:rPr>
+      </w:pPr>
+      <w:r>
+        <w:rPr>
+          <w:rFonts w:ascii="Cambria" w:hAnsi="Cambria"/>
+          <w:sz w:val="24"/>
+          <w:szCs w:val="24"/>
+        </w:rPr>
         <w:t>Data Analysis</w:t>
       </w:r>
     </w:p>
@@ -557,8 +1077,18 @@
           <w:ilvl w:val="0"/>
           <w:numId w:val="34"/>
         </w:numPr>
-      </w:pPr>
-      <w:r>
+        <w:rPr>
+          <w:rFonts w:ascii="Cambria" w:hAnsi="Cambria"/>
+          <w:sz w:val="24"/>
+          <w:szCs w:val="24"/>
+        </w:rPr>
+      </w:pPr>
+      <w:r>
+        <w:rPr>
+          <w:rFonts w:ascii="Cambria" w:hAnsi="Cambria"/>
+          <w:sz w:val="24"/>
+          <w:szCs w:val="24"/>
+        </w:rPr>
         <w:t>Feature Selection</w:t>
       </w:r>
     </w:p>
@@ -568,8 +1098,18 @@
           <w:ilvl w:val="0"/>
           <w:numId w:val="34"/>
         </w:numPr>
-      </w:pPr>
-      <w:r>
+        <w:rPr>
+          <w:rFonts w:ascii="Cambria" w:hAnsi="Cambria"/>
+          <w:sz w:val="24"/>
+          <w:szCs w:val="24"/>
+        </w:rPr>
+      </w:pPr>
+      <w:r>
+        <w:rPr>
+          <w:rFonts w:ascii="Cambria" w:hAnsi="Cambria"/>
+          <w:sz w:val="24"/>
+          <w:szCs w:val="24"/>
+        </w:rPr>
         <w:t>Model Training</w:t>
       </w:r>
     </w:p>
@@ -579,8 +1119,18 @@
           <w:ilvl w:val="0"/>
           <w:numId w:val="34"/>
         </w:numPr>
-      </w:pPr>
-      <w:r>
+        <w:rPr>
+          <w:rFonts w:ascii="Cambria" w:hAnsi="Cambria"/>
+          <w:sz w:val="24"/>
+          <w:szCs w:val="24"/>
+        </w:rPr>
+      </w:pPr>
+      <w:r>
+        <w:rPr>
+          <w:rFonts w:ascii="Cambria" w:hAnsi="Cambria"/>
+          <w:sz w:val="24"/>
+          <w:szCs w:val="24"/>
+        </w:rPr>
         <w:t>Model Evaluation</w:t>
       </w:r>
     </w:p>
@@ -590,16 +1140,36 @@
           <w:ilvl w:val="0"/>
           <w:numId w:val="34"/>
         </w:numPr>
-      </w:pPr>
-      <w:r>
+        <w:rPr>
+          <w:rFonts w:ascii="Cambria" w:hAnsi="Cambria"/>
+          <w:sz w:val="24"/>
+          <w:szCs w:val="24"/>
+        </w:rPr>
+      </w:pPr>
+      <w:r>
+        <w:rPr>
+          <w:rFonts w:ascii="Cambria" w:hAnsi="Cambria"/>
+          <w:sz w:val="24"/>
+          <w:szCs w:val="24"/>
+        </w:rPr>
         <w:t>Deployment</w:t>
       </w:r>
     </w:p>
     <w:p>
       <w:pPr>
         <w:pStyle w:val="Heading2"/>
-      </w:pPr>
-      <w:r>
+        <w:rPr>
+          <w:rFonts w:ascii="Cambria" w:hAnsi="Cambria"/>
+          <w:sz w:val="24"/>
+          <w:szCs w:val="24"/>
+        </w:rPr>
+      </w:pPr>
+      <w:r>
+        <w:rPr>
+          <w:rFonts w:ascii="Cambria" w:hAnsi="Cambria"/>
+          <w:sz w:val="24"/>
+          <w:szCs w:val="24"/>
+        </w:rPr>
         <w:t>Installing Conda (Overview)</w:t>
       </w:r>
     </w:p>
@@ -609,27 +1179,50 @@
           <w:ilvl w:val="0"/>
           <w:numId w:val="35"/>
         </w:numPr>
-      </w:pPr>
-      <w:r>
+        <w:rPr>
+          <w:rFonts w:ascii="Cambria" w:hAnsi="Cambria"/>
+          <w:sz w:val="24"/>
+          <w:szCs w:val="24"/>
+        </w:rPr>
+      </w:pPr>
+      <w:r>
+        <w:rPr>
+          <w:rFonts w:ascii="Cambria" w:hAnsi="Cambria"/>
+          <w:sz w:val="24"/>
+          <w:szCs w:val="24"/>
+        </w:rPr>
         <w:t xml:space="preserve">Download </w:t>
       </w:r>
       <w:r>
         <w:rPr>
+          <w:rFonts w:ascii="Cambria" w:hAnsi="Cambria"/>
           <w:b/>
           <w:bCs/>
+          <w:sz w:val="24"/>
+          <w:szCs w:val="24"/>
         </w:rPr>
         <w:t>Anaconda</w:t>
       </w:r>
       <w:r>
+        <w:rPr>
+          <w:rFonts w:ascii="Cambria" w:hAnsi="Cambria"/>
+          <w:sz w:val="24"/>
+          <w:szCs w:val="24"/>
+        </w:rPr>
         <w:t xml:space="preserve"> or </w:t>
       </w:r>
-      <w:r>
-        <w:rPr>
+      <w:proofErr w:type="spellStart"/>
+      <w:r>
+        <w:rPr>
+          <w:rFonts w:ascii="Cambria" w:hAnsi="Cambria"/>
           <w:b/>
           <w:bCs/>
+          <w:sz w:val="24"/>
+          <w:szCs w:val="24"/>
         </w:rPr>
         <w:t>Miniconda</w:t>
       </w:r>
+      <w:proofErr w:type="spellEnd"/>
     </w:p>
     <w:p>
       <w:pPr>
@@ -637,8 +1230,18 @@
           <w:ilvl w:val="0"/>
           <w:numId w:val="35"/>
         </w:numPr>
-      </w:pPr>
-      <w:r>
+        <w:rPr>
+          <w:rFonts w:ascii="Cambria" w:hAnsi="Cambria"/>
+          <w:sz w:val="24"/>
+          <w:szCs w:val="24"/>
+        </w:rPr>
+      </w:pPr>
+      <w:r>
+        <w:rPr>
+          <w:rFonts w:ascii="Cambria" w:hAnsi="Cambria"/>
+          <w:sz w:val="24"/>
+          <w:szCs w:val="24"/>
+        </w:rPr>
         <w:t>Install it on your system</w:t>
       </w:r>
     </w:p>
@@ -648,8 +1251,18 @@
           <w:ilvl w:val="0"/>
           <w:numId w:val="35"/>
         </w:numPr>
-      </w:pPr>
-      <w:r>
+        <w:rPr>
+          <w:rFonts w:ascii="Cambria" w:hAnsi="Cambria"/>
+          <w:sz w:val="24"/>
+          <w:szCs w:val="24"/>
+        </w:rPr>
+      </w:pPr>
+      <w:r>
+        <w:rPr>
+          <w:rFonts w:ascii="Cambria" w:hAnsi="Cambria"/>
+          <w:sz w:val="24"/>
+          <w:szCs w:val="24"/>
+        </w:rPr>
         <w:t>Open the Conda terminal</w:t>
       </w:r>
     </w:p>
@@ -659,8 +1272,18 @@
           <w:ilvl w:val="0"/>
           <w:numId w:val="35"/>
         </w:numPr>
-      </w:pPr>
-      <w:r>
+        <w:rPr>
+          <w:rFonts w:ascii="Cambria" w:hAnsi="Cambria"/>
+          <w:sz w:val="24"/>
+          <w:szCs w:val="24"/>
+        </w:rPr>
+      </w:pPr>
+      <w:r>
+        <w:rPr>
+          <w:rFonts w:ascii="Cambria" w:hAnsi="Cambria"/>
+          <w:sz w:val="24"/>
+          <w:szCs w:val="24"/>
+        </w:rPr>
         <w:t>Create a new environment for your project</w:t>
       </w:r>
     </w:p>
@@ -670,16 +1293,36 @@
           <w:ilvl w:val="0"/>
           <w:numId w:val="35"/>
         </w:numPr>
-      </w:pPr>
-      <w:r>
+        <w:rPr>
+          <w:rFonts w:ascii="Cambria" w:hAnsi="Cambria"/>
+          <w:sz w:val="24"/>
+          <w:szCs w:val="24"/>
+        </w:rPr>
+      </w:pPr>
+      <w:r>
+        <w:rPr>
+          <w:rFonts w:ascii="Cambria" w:hAnsi="Cambria"/>
+          <w:sz w:val="24"/>
+          <w:szCs w:val="24"/>
+        </w:rPr>
         <w:t>Install required libraries</w:t>
       </w:r>
     </w:p>
     <w:p>
       <w:pPr>
         <w:pStyle w:val="Heading2"/>
-      </w:pPr>
-      <w:r>
+        <w:rPr>
+          <w:rFonts w:ascii="Cambria" w:hAnsi="Cambria"/>
+          <w:sz w:val="24"/>
+          <w:szCs w:val="24"/>
+        </w:rPr>
+      </w:pPr>
+      <w:r>
+        <w:rPr>
+          <w:rFonts w:ascii="Cambria" w:hAnsi="Cambria"/>
+          <w:sz w:val="24"/>
+          <w:szCs w:val="24"/>
+        </w:rPr>
         <w:t>Summary</w:t>
       </w:r>
     </w:p>
@@ -689,15 +1332,29 @@
           <w:ilvl w:val="0"/>
           <w:numId w:val="36"/>
         </w:numPr>
-      </w:pPr>
-      <w:r>
-        <w:rPr>
+        <w:rPr>
+          <w:rFonts w:ascii="Cambria" w:hAnsi="Cambria"/>
+          <w:sz w:val="24"/>
+          <w:szCs w:val="24"/>
+        </w:rPr>
+      </w:pPr>
+      <w:r>
+        <w:rPr>
+          <w:rFonts w:ascii="Cambria" w:hAnsi="Cambria"/>
           <w:b/>
           <w:bCs/>
-        </w:rPr>
+          <w:sz w:val="24"/>
+          <w:szCs w:val="24"/>
+        </w:rPr>
+        <w:lastRenderedPageBreak/>
         <w:t>Mr Conda</w:t>
       </w:r>
       <w:r>
+        <w:rPr>
+          <w:rFonts w:ascii="Cambria" w:hAnsi="Cambria"/>
+          <w:sz w:val="24"/>
+          <w:szCs w:val="24"/>
+        </w:rPr>
         <w:t xml:space="preserve"> helps manage machine learning environments</w:t>
       </w:r>
     </w:p>
@@ -707,15 +1364,28 @@
           <w:ilvl w:val="0"/>
           <w:numId w:val="36"/>
         </w:numPr>
-      </w:pPr>
-      <w:r>
-        <w:rPr>
+        <w:rPr>
+          <w:rFonts w:ascii="Cambria" w:hAnsi="Cambria"/>
+          <w:sz w:val="24"/>
+          <w:szCs w:val="24"/>
+        </w:rPr>
+      </w:pPr>
+      <w:r>
+        <w:rPr>
+          <w:rFonts w:ascii="Cambria" w:hAnsi="Cambria"/>
           <w:b/>
           <w:bCs/>
+          <w:sz w:val="24"/>
+          <w:szCs w:val="24"/>
         </w:rPr>
         <w:t>Anaconda</w:t>
       </w:r>
       <w:r>
+        <w:rPr>
+          <w:rFonts w:ascii="Cambria" w:hAnsi="Cambria"/>
+          <w:sz w:val="24"/>
+          <w:szCs w:val="24"/>
+        </w:rPr>
         <w:t xml:space="preserve"> is heavy but beginner-friendly</w:t>
       </w:r>
     </w:p>
@@ -725,15 +1395,30 @@
           <w:ilvl w:val="0"/>
           <w:numId w:val="36"/>
         </w:numPr>
-      </w:pPr>
-      <w:r>
-        <w:rPr>
+        <w:rPr>
+          <w:rFonts w:ascii="Cambria" w:hAnsi="Cambria"/>
+          <w:sz w:val="24"/>
+          <w:szCs w:val="24"/>
+        </w:rPr>
+      </w:pPr>
+      <w:proofErr w:type="spellStart"/>
+      <w:r>
+        <w:rPr>
+          <w:rFonts w:ascii="Cambria" w:hAnsi="Cambria"/>
           <w:b/>
           <w:bCs/>
+          <w:sz w:val="24"/>
+          <w:szCs w:val="24"/>
         </w:rPr>
         <w:t>Miniconda</w:t>
       </w:r>
-      <w:r>
+      <w:proofErr w:type="spellEnd"/>
+      <w:r>
+        <w:rPr>
+          <w:rFonts w:ascii="Cambria" w:hAnsi="Cambria"/>
+          <w:sz w:val="24"/>
+          <w:szCs w:val="24"/>
+        </w:rPr>
         <w:t xml:space="preserve"> is lightweight and flexible</w:t>
       </w:r>
     </w:p>
@@ -743,14 +1428,1517 @@
           <w:ilvl w:val="0"/>
           <w:numId w:val="36"/>
         </w:numPr>
-      </w:pPr>
-      <w:r>
+        <w:rPr>
+          <w:rFonts w:ascii="Cambria" w:hAnsi="Cambria"/>
+          <w:sz w:val="24"/>
+          <w:szCs w:val="24"/>
+        </w:rPr>
+      </w:pPr>
+      <w:r>
+        <w:rPr>
+          <w:rFonts w:ascii="Cambria" w:hAnsi="Cambria"/>
+          <w:sz w:val="24"/>
+          <w:szCs w:val="24"/>
+        </w:rPr>
         <w:t>Proper environment setup is important for clean and efficient projects</w:t>
       </w:r>
     </w:p>
     <w:p>
       <w:pPr>
-        <w:rPr>
+        <w:pStyle w:val="Heading1"/>
+        <w:rPr>
+          <w:rFonts w:ascii="Cambria" w:hAnsi="Cambria"/>
+          <w:sz w:val="24"/>
+          <w:szCs w:val="24"/>
+          <w:lang w:val="en-US"/>
+        </w:rPr>
+      </w:pPr>
+      <w:r>
+        <w:rPr>
+          <w:rFonts w:ascii="Cambria" w:hAnsi="Cambria"/>
+          <w:sz w:val="24"/>
+          <w:szCs w:val="24"/>
+          <w:lang w:val="en-US"/>
+        </w:rPr>
+        <w:t>Installing Jupyter Notebook</w:t>
+      </w:r>
+    </w:p>
+    <w:p>
+      <w:pPr>
+        <w:pStyle w:val="Heading2"/>
+        <w:rPr>
+          <w:rFonts w:ascii="Cambria" w:hAnsi="Cambria"/>
+          <w:sz w:val="24"/>
+          <w:szCs w:val="24"/>
+        </w:rPr>
+      </w:pPr>
+      <w:r>
+        <w:rPr>
+          <w:rFonts w:ascii="Cambria" w:hAnsi="Cambria"/>
+          <w:sz w:val="24"/>
+          <w:szCs w:val="24"/>
+        </w:rPr>
+        <w:t xml:space="preserve">What is </w:t>
+      </w:r>
+      <w:proofErr w:type="spellStart"/>
+      <w:r>
+        <w:rPr>
+          <w:rFonts w:ascii="Cambria" w:hAnsi="Cambria"/>
+          <w:sz w:val="24"/>
+          <w:szCs w:val="24"/>
+        </w:rPr>
+        <w:t>Jupyter</w:t>
+      </w:r>
+      <w:proofErr w:type="spellEnd"/>
+      <w:r>
+        <w:rPr>
+          <w:rFonts w:ascii="Cambria" w:hAnsi="Cambria"/>
+          <w:sz w:val="24"/>
+          <w:szCs w:val="24"/>
+        </w:rPr>
+        <w:t xml:space="preserve"> Notebook?</w:t>
+      </w:r>
+    </w:p>
+    <w:p>
+      <w:pPr>
+        <w:numPr>
+          <w:ilvl w:val="0"/>
+          <w:numId w:val="37"/>
+        </w:numPr>
+        <w:rPr>
+          <w:rFonts w:ascii="Cambria" w:hAnsi="Cambria"/>
+          <w:sz w:val="24"/>
+          <w:szCs w:val="24"/>
+        </w:rPr>
+      </w:pPr>
+      <w:proofErr w:type="spellStart"/>
+      <w:r>
+        <w:rPr>
+          <w:rFonts w:ascii="Cambria" w:hAnsi="Cambria"/>
+          <w:sz w:val="24"/>
+          <w:szCs w:val="24"/>
+        </w:rPr>
+        <w:t>Jupyter</w:t>
+      </w:r>
+      <w:proofErr w:type="spellEnd"/>
+      <w:r>
+        <w:rPr>
+          <w:rFonts w:ascii="Cambria" w:hAnsi="Cambria"/>
+          <w:sz w:val="24"/>
+          <w:szCs w:val="24"/>
+        </w:rPr>
+        <w:t xml:space="preserve"> Notebook is a </w:t>
+      </w:r>
+      <w:r>
+        <w:rPr>
+          <w:rFonts w:ascii="Cambria" w:hAnsi="Cambria"/>
+          <w:b/>
+          <w:bCs/>
+          <w:sz w:val="24"/>
+          <w:szCs w:val="24"/>
+        </w:rPr>
+        <w:t>web-based tool</w:t>
+      </w:r>
+      <w:r>
+        <w:rPr>
+          <w:rFonts w:ascii="Cambria" w:hAnsi="Cambria"/>
+          <w:sz w:val="24"/>
+          <w:szCs w:val="24"/>
+        </w:rPr>
+        <w:t>.</w:t>
+      </w:r>
+    </w:p>
+    <w:p>
+      <w:pPr>
+        <w:numPr>
+          <w:ilvl w:val="0"/>
+          <w:numId w:val="37"/>
+        </w:numPr>
+        <w:rPr>
+          <w:rFonts w:ascii="Cambria" w:hAnsi="Cambria"/>
+          <w:sz w:val="24"/>
+          <w:szCs w:val="24"/>
+        </w:rPr>
+      </w:pPr>
+      <w:r>
+        <w:rPr>
+          <w:rFonts w:ascii="Cambria" w:hAnsi="Cambria"/>
+          <w:sz w:val="24"/>
+          <w:szCs w:val="24"/>
+        </w:rPr>
+        <w:t>It is used for:</w:t>
+      </w:r>
+    </w:p>
+    <w:p>
+      <w:pPr>
+        <w:numPr>
+          <w:ilvl w:val="1"/>
+          <w:numId w:val="37"/>
+        </w:numPr>
+        <w:rPr>
+          <w:rFonts w:ascii="Cambria" w:hAnsi="Cambria"/>
+          <w:sz w:val="24"/>
+          <w:szCs w:val="24"/>
+        </w:rPr>
+      </w:pPr>
+      <w:r>
+        <w:rPr>
+          <w:rFonts w:ascii="Cambria" w:hAnsi="Cambria"/>
+          <w:sz w:val="24"/>
+          <w:szCs w:val="24"/>
+        </w:rPr>
+        <w:t>Writing Python code</w:t>
+      </w:r>
+    </w:p>
+    <w:p>
+      <w:pPr>
+        <w:numPr>
+          <w:ilvl w:val="1"/>
+          <w:numId w:val="37"/>
+        </w:numPr>
+        <w:rPr>
+          <w:rFonts w:ascii="Cambria" w:hAnsi="Cambria"/>
+          <w:sz w:val="24"/>
+          <w:szCs w:val="24"/>
+        </w:rPr>
+      </w:pPr>
+      <w:r>
+        <w:rPr>
+          <w:rFonts w:ascii="Cambria" w:hAnsi="Cambria"/>
+          <w:sz w:val="24"/>
+          <w:szCs w:val="24"/>
+        </w:rPr>
+        <w:t>Data analysis</w:t>
+      </w:r>
+    </w:p>
+    <w:p>
+      <w:pPr>
+        <w:numPr>
+          <w:ilvl w:val="1"/>
+          <w:numId w:val="37"/>
+        </w:numPr>
+        <w:rPr>
+          <w:rFonts w:ascii="Cambria" w:hAnsi="Cambria"/>
+          <w:sz w:val="24"/>
+          <w:szCs w:val="24"/>
+        </w:rPr>
+      </w:pPr>
+      <w:r>
+        <w:rPr>
+          <w:rFonts w:ascii="Cambria" w:hAnsi="Cambria"/>
+          <w:sz w:val="24"/>
+          <w:szCs w:val="24"/>
+        </w:rPr>
+        <w:t>Machine learning</w:t>
+      </w:r>
+    </w:p>
+    <w:p>
+      <w:pPr>
+        <w:numPr>
+          <w:ilvl w:val="1"/>
+          <w:numId w:val="37"/>
+        </w:numPr>
+        <w:rPr>
+          <w:rFonts w:ascii="Cambria" w:hAnsi="Cambria"/>
+          <w:sz w:val="24"/>
+          <w:szCs w:val="24"/>
+        </w:rPr>
+      </w:pPr>
+      <w:r>
+        <w:rPr>
+          <w:rFonts w:ascii="Cambria" w:hAnsi="Cambria"/>
+          <w:sz w:val="24"/>
+          <w:szCs w:val="24"/>
+        </w:rPr>
+        <w:t>Visualization</w:t>
+      </w:r>
+    </w:p>
+    <w:p>
+      <w:pPr>
+        <w:numPr>
+          <w:ilvl w:val="0"/>
+          <w:numId w:val="37"/>
+        </w:numPr>
+        <w:rPr>
+          <w:rFonts w:ascii="Cambria" w:hAnsi="Cambria"/>
+          <w:sz w:val="24"/>
+          <w:szCs w:val="24"/>
+        </w:rPr>
+      </w:pPr>
+      <w:r>
+        <w:rPr>
+          <w:rFonts w:ascii="Cambria" w:hAnsi="Cambria"/>
+          <w:sz w:val="24"/>
+          <w:szCs w:val="24"/>
+        </w:rPr>
+        <w:t xml:space="preserve">Code and output appear </w:t>
+      </w:r>
+      <w:r>
+        <w:rPr>
+          <w:rFonts w:ascii="Cambria" w:hAnsi="Cambria"/>
+          <w:b/>
+          <w:bCs/>
+          <w:sz w:val="24"/>
+          <w:szCs w:val="24"/>
+        </w:rPr>
+        <w:t>in the same place</w:t>
+      </w:r>
+      <w:r>
+        <w:rPr>
+          <w:rFonts w:ascii="Cambria" w:hAnsi="Cambria"/>
+          <w:sz w:val="24"/>
+          <w:szCs w:val="24"/>
+        </w:rPr>
+        <w:t>.</w:t>
+      </w:r>
+    </w:p>
+    <w:p>
+      <w:pPr>
+        <w:pStyle w:val="Heading2"/>
+        <w:rPr>
+          <w:rFonts w:ascii="Cambria" w:hAnsi="Cambria"/>
+          <w:sz w:val="24"/>
+          <w:szCs w:val="24"/>
+        </w:rPr>
+      </w:pPr>
+      <w:r>
+        <w:rPr>
+          <w:rFonts w:ascii="Cambria" w:hAnsi="Cambria"/>
+          <w:sz w:val="24"/>
+          <w:szCs w:val="24"/>
+        </w:rPr>
+        <w:t xml:space="preserve">Why Use </w:t>
+      </w:r>
+      <w:proofErr w:type="spellStart"/>
+      <w:r>
+        <w:rPr>
+          <w:rFonts w:ascii="Cambria" w:hAnsi="Cambria"/>
+          <w:sz w:val="24"/>
+          <w:szCs w:val="24"/>
+        </w:rPr>
+        <w:t>Jupyter</w:t>
+      </w:r>
+      <w:proofErr w:type="spellEnd"/>
+      <w:r>
+        <w:rPr>
+          <w:rFonts w:ascii="Cambria" w:hAnsi="Cambria"/>
+          <w:sz w:val="24"/>
+          <w:szCs w:val="24"/>
+        </w:rPr>
+        <w:t xml:space="preserve"> Notebook?</w:t>
+      </w:r>
+    </w:p>
+    <w:p>
+      <w:pPr>
+        <w:numPr>
+          <w:ilvl w:val="0"/>
+          <w:numId w:val="38"/>
+        </w:numPr>
+        <w:rPr>
+          <w:rFonts w:ascii="Cambria" w:hAnsi="Cambria"/>
+          <w:sz w:val="24"/>
+          <w:szCs w:val="24"/>
+        </w:rPr>
+      </w:pPr>
+      <w:r>
+        <w:rPr>
+          <w:rFonts w:ascii="Cambria" w:hAnsi="Cambria"/>
+          <w:sz w:val="24"/>
+          <w:szCs w:val="24"/>
+        </w:rPr>
+        <w:t>Easy to use for beginners</w:t>
+      </w:r>
+    </w:p>
+    <w:p>
+      <w:pPr>
+        <w:numPr>
+          <w:ilvl w:val="0"/>
+          <w:numId w:val="38"/>
+        </w:numPr>
+        <w:rPr>
+          <w:rFonts w:ascii="Cambria" w:hAnsi="Cambria"/>
+          <w:sz w:val="24"/>
+          <w:szCs w:val="24"/>
+        </w:rPr>
+      </w:pPr>
+      <w:r>
+        <w:rPr>
+          <w:rFonts w:ascii="Cambria" w:hAnsi="Cambria"/>
+          <w:sz w:val="24"/>
+          <w:szCs w:val="24"/>
+        </w:rPr>
+        <w:t>Shows code, output, and notes together</w:t>
+      </w:r>
+    </w:p>
+    <w:p>
+      <w:pPr>
+        <w:numPr>
+          <w:ilvl w:val="0"/>
+          <w:numId w:val="38"/>
+        </w:numPr>
+        <w:rPr>
+          <w:rFonts w:ascii="Cambria" w:hAnsi="Cambria"/>
+          <w:sz w:val="24"/>
+          <w:szCs w:val="24"/>
+        </w:rPr>
+      </w:pPr>
+      <w:r>
+        <w:rPr>
+          <w:rFonts w:ascii="Cambria" w:hAnsi="Cambria"/>
+          <w:sz w:val="24"/>
+          <w:szCs w:val="24"/>
+        </w:rPr>
+        <w:t xml:space="preserve">Very useful for </w:t>
+      </w:r>
+      <w:r>
+        <w:rPr>
+          <w:rFonts w:ascii="Cambria" w:hAnsi="Cambria"/>
+          <w:b/>
+          <w:bCs/>
+          <w:sz w:val="24"/>
+          <w:szCs w:val="24"/>
+        </w:rPr>
+        <w:t>data science and ML projects</w:t>
+      </w:r>
+    </w:p>
+    <w:p>
+      <w:pPr>
+        <w:pStyle w:val="Heading2"/>
+        <w:rPr>
+          <w:rFonts w:ascii="Cambria" w:hAnsi="Cambria"/>
+          <w:sz w:val="24"/>
+          <w:szCs w:val="24"/>
+        </w:rPr>
+      </w:pPr>
+      <w:r>
+        <w:rPr>
+          <w:rFonts w:ascii="Cambria" w:hAnsi="Cambria"/>
+          <w:sz w:val="24"/>
+          <w:szCs w:val="24"/>
+        </w:rPr>
+        <w:t xml:space="preserve">Methods to Install </w:t>
+      </w:r>
+      <w:proofErr w:type="spellStart"/>
+      <w:r>
+        <w:rPr>
+          <w:rFonts w:ascii="Cambria" w:hAnsi="Cambria"/>
+          <w:sz w:val="24"/>
+          <w:szCs w:val="24"/>
+        </w:rPr>
+        <w:t>Jupyter</w:t>
+      </w:r>
+      <w:proofErr w:type="spellEnd"/>
+      <w:r>
+        <w:rPr>
+          <w:rFonts w:ascii="Cambria" w:hAnsi="Cambria"/>
+          <w:sz w:val="24"/>
+          <w:szCs w:val="24"/>
+        </w:rPr>
+        <w:t xml:space="preserve"> Notebook</w:t>
+      </w:r>
+    </w:p>
+    <w:p>
+      <w:pPr>
+        <w:pStyle w:val="Heading3"/>
+        <w:rPr>
+          <w:rFonts w:ascii="Cambria" w:hAnsi="Cambria"/>
+          <w:sz w:val="24"/>
+          <w:szCs w:val="24"/>
+        </w:rPr>
+      </w:pPr>
+      <w:r>
+        <w:rPr>
+          <w:rFonts w:ascii="Cambria" w:hAnsi="Cambria"/>
+          <w:sz w:val="24"/>
+          <w:szCs w:val="24"/>
+        </w:rPr>
+        <w:t>Method 1: Using Anaconda (Recommended)</w:t>
+      </w:r>
+    </w:p>
+    <w:p>
+      <w:pPr>
+        <w:numPr>
+          <w:ilvl w:val="0"/>
+          <w:numId w:val="39"/>
+        </w:numPr>
+        <w:rPr>
+          <w:rFonts w:ascii="Cambria" w:hAnsi="Cambria"/>
+          <w:sz w:val="24"/>
+          <w:szCs w:val="24"/>
+        </w:rPr>
+      </w:pPr>
+      <w:proofErr w:type="spellStart"/>
+      <w:r>
+        <w:rPr>
+          <w:rFonts w:ascii="Cambria" w:hAnsi="Cambria"/>
+          <w:sz w:val="24"/>
+          <w:szCs w:val="24"/>
+        </w:rPr>
+        <w:t>Jupyter</w:t>
+      </w:r>
+      <w:proofErr w:type="spellEnd"/>
+      <w:r>
+        <w:rPr>
+          <w:rFonts w:ascii="Cambria" w:hAnsi="Cambria"/>
+          <w:sz w:val="24"/>
+          <w:szCs w:val="24"/>
+        </w:rPr>
+        <w:t xml:space="preserve"> Notebook comes </w:t>
+      </w:r>
+      <w:r>
+        <w:rPr>
+          <w:rFonts w:ascii="Cambria" w:hAnsi="Cambria"/>
+          <w:b/>
+          <w:bCs/>
+          <w:sz w:val="24"/>
+          <w:szCs w:val="24"/>
+        </w:rPr>
+        <w:t>pre-installed</w:t>
+      </w:r>
+    </w:p>
+    <w:p>
+      <w:pPr>
+        <w:numPr>
+          <w:ilvl w:val="0"/>
+          <w:numId w:val="39"/>
+        </w:numPr>
+        <w:rPr>
+          <w:rFonts w:ascii="Cambria" w:hAnsi="Cambria"/>
+          <w:sz w:val="24"/>
+          <w:szCs w:val="24"/>
+        </w:rPr>
+      </w:pPr>
+      <w:r>
+        <w:rPr>
+          <w:rFonts w:ascii="Cambria" w:hAnsi="Cambria"/>
+          <w:sz w:val="24"/>
+          <w:szCs w:val="24"/>
+        </w:rPr>
+        <w:t>No extra setup required</w:t>
+      </w:r>
+    </w:p>
+    <w:p>
+      <w:pPr>
+        <w:pStyle w:val="Heading3"/>
+        <w:rPr>
+          <w:rFonts w:ascii="Cambria" w:hAnsi="Cambria"/>
+          <w:sz w:val="24"/>
+          <w:szCs w:val="24"/>
+        </w:rPr>
+      </w:pPr>
+      <w:r>
+        <w:rPr>
+          <w:rFonts w:ascii="Cambria" w:hAnsi="Cambria"/>
+          <w:sz w:val="24"/>
+          <w:szCs w:val="24"/>
+        </w:rPr>
+        <w:t>Steps:</w:t>
+      </w:r>
+    </w:p>
+    <w:p>
+      <w:pPr>
+        <w:numPr>
+          <w:ilvl w:val="0"/>
+          <w:numId w:val="40"/>
+        </w:numPr>
+        <w:rPr>
+          <w:rFonts w:ascii="Cambria" w:hAnsi="Cambria"/>
+          <w:sz w:val="24"/>
+          <w:szCs w:val="24"/>
+        </w:rPr>
+      </w:pPr>
+      <w:r>
+        <w:rPr>
+          <w:rFonts w:ascii="Cambria" w:hAnsi="Cambria"/>
+          <w:sz w:val="24"/>
+          <w:szCs w:val="24"/>
+        </w:rPr>
+        <w:t xml:space="preserve">Install </w:t>
+      </w:r>
+      <w:r>
+        <w:rPr>
+          <w:rFonts w:ascii="Cambria" w:hAnsi="Cambria"/>
+          <w:b/>
+          <w:bCs/>
+          <w:sz w:val="24"/>
+          <w:szCs w:val="24"/>
+        </w:rPr>
+        <w:t>Anaconda</w:t>
+      </w:r>
+    </w:p>
+    <w:p>
+      <w:pPr>
+        <w:numPr>
+          <w:ilvl w:val="0"/>
+          <w:numId w:val="40"/>
+        </w:numPr>
+        <w:rPr>
+          <w:rFonts w:ascii="Cambria" w:hAnsi="Cambria"/>
+          <w:sz w:val="24"/>
+          <w:szCs w:val="24"/>
+        </w:rPr>
+      </w:pPr>
+      <w:r>
+        <w:rPr>
+          <w:rFonts w:ascii="Cambria" w:hAnsi="Cambria"/>
+          <w:sz w:val="24"/>
+          <w:szCs w:val="24"/>
+        </w:rPr>
+        <w:t xml:space="preserve">Open </w:t>
+      </w:r>
+      <w:r>
+        <w:rPr>
+          <w:rFonts w:ascii="Cambria" w:hAnsi="Cambria"/>
+          <w:b/>
+          <w:bCs/>
+          <w:sz w:val="24"/>
+          <w:szCs w:val="24"/>
+        </w:rPr>
+        <w:t>Anaconda Navigator</w:t>
+      </w:r>
+    </w:p>
+    <w:p>
+      <w:pPr>
+        <w:numPr>
+          <w:ilvl w:val="0"/>
+          <w:numId w:val="40"/>
+        </w:numPr>
+        <w:rPr>
+          <w:rFonts w:ascii="Cambria" w:hAnsi="Cambria"/>
+          <w:sz w:val="24"/>
+          <w:szCs w:val="24"/>
+        </w:rPr>
+      </w:pPr>
+      <w:r>
+        <w:rPr>
+          <w:rFonts w:ascii="Cambria" w:hAnsi="Cambria"/>
+          <w:sz w:val="24"/>
+          <w:szCs w:val="24"/>
+        </w:rPr>
+        <w:t xml:space="preserve">Click </w:t>
+      </w:r>
+      <w:r>
+        <w:rPr>
+          <w:rFonts w:ascii="Cambria" w:hAnsi="Cambria"/>
+          <w:b/>
+          <w:bCs/>
+          <w:sz w:val="24"/>
+          <w:szCs w:val="24"/>
+        </w:rPr>
+        <w:t>Launch</w:t>
+      </w:r>
+      <w:r>
+        <w:rPr>
+          <w:rFonts w:ascii="Cambria" w:hAnsi="Cambria"/>
+          <w:sz w:val="24"/>
+          <w:szCs w:val="24"/>
+        </w:rPr>
+        <w:t xml:space="preserve"> on </w:t>
+      </w:r>
+      <w:proofErr w:type="spellStart"/>
+      <w:r>
+        <w:rPr>
+          <w:rFonts w:ascii="Cambria" w:hAnsi="Cambria"/>
+          <w:sz w:val="24"/>
+          <w:szCs w:val="24"/>
+        </w:rPr>
+        <w:t>Jupyter</w:t>
+      </w:r>
+      <w:proofErr w:type="spellEnd"/>
+      <w:r>
+        <w:rPr>
+          <w:rFonts w:ascii="Cambria" w:hAnsi="Cambria"/>
+          <w:sz w:val="24"/>
+          <w:szCs w:val="24"/>
+        </w:rPr>
+        <w:t xml:space="preserve"> Notebook</w:t>
+      </w:r>
+    </w:p>
+    <w:p>
+      <w:pPr>
+        <w:pStyle w:val="Heading3"/>
+        <w:rPr>
+          <w:rFonts w:ascii="Cambria" w:hAnsi="Cambria"/>
+          <w:sz w:val="24"/>
+          <w:szCs w:val="24"/>
+        </w:rPr>
+      </w:pPr>
+      <w:r>
+        <w:rPr>
+          <w:rFonts w:ascii="Cambria" w:hAnsi="Cambria"/>
+          <w:sz w:val="24"/>
+          <w:szCs w:val="24"/>
+        </w:rPr>
+        <w:t xml:space="preserve">Method 2: Using </w:t>
+      </w:r>
+      <w:proofErr w:type="spellStart"/>
+      <w:r>
+        <w:rPr>
+          <w:rFonts w:ascii="Cambria" w:hAnsi="Cambria"/>
+          <w:sz w:val="24"/>
+          <w:szCs w:val="24"/>
+        </w:rPr>
+        <w:t>Miniconda</w:t>
+      </w:r>
+      <w:proofErr w:type="spellEnd"/>
+    </w:p>
+    <w:p>
+      <w:pPr>
+        <w:numPr>
+          <w:ilvl w:val="0"/>
+          <w:numId w:val="41"/>
+        </w:numPr>
+        <w:rPr>
+          <w:rFonts w:ascii="Cambria" w:hAnsi="Cambria"/>
+          <w:sz w:val="24"/>
+          <w:szCs w:val="24"/>
+        </w:rPr>
+      </w:pPr>
+      <w:proofErr w:type="spellStart"/>
+      <w:r>
+        <w:rPr>
+          <w:rFonts w:ascii="Cambria" w:hAnsi="Cambria"/>
+          <w:sz w:val="24"/>
+          <w:szCs w:val="24"/>
+        </w:rPr>
+        <w:lastRenderedPageBreak/>
+        <w:t>Jupyter</w:t>
+      </w:r>
+      <w:proofErr w:type="spellEnd"/>
+      <w:r>
+        <w:rPr>
+          <w:rFonts w:ascii="Cambria" w:hAnsi="Cambria"/>
+          <w:sz w:val="24"/>
+          <w:szCs w:val="24"/>
+        </w:rPr>
+        <w:t xml:space="preserve"> is installed manually</w:t>
+      </w:r>
+    </w:p>
+    <w:p>
+      <w:pPr>
+        <w:pStyle w:val="Heading3"/>
+        <w:rPr>
+          <w:rFonts w:ascii="Cambria" w:hAnsi="Cambria"/>
+          <w:sz w:val="24"/>
+          <w:szCs w:val="24"/>
+        </w:rPr>
+      </w:pPr>
+      <w:r>
+        <w:rPr>
+          <w:rFonts w:ascii="Cambria" w:hAnsi="Cambria"/>
+          <w:sz w:val="24"/>
+          <w:szCs w:val="24"/>
+        </w:rPr>
+        <w:t>Steps:</w:t>
+      </w:r>
+    </w:p>
+    <w:p>
+      <w:pPr>
+        <w:numPr>
+          <w:ilvl w:val="0"/>
+          <w:numId w:val="42"/>
+        </w:numPr>
+        <w:rPr>
+          <w:rFonts w:ascii="Cambria" w:hAnsi="Cambria"/>
+          <w:sz w:val="24"/>
+          <w:szCs w:val="24"/>
+        </w:rPr>
+      </w:pPr>
+      <w:r>
+        <w:rPr>
+          <w:rFonts w:ascii="Cambria" w:hAnsi="Cambria"/>
+          <w:sz w:val="24"/>
+          <w:szCs w:val="24"/>
+        </w:rPr>
+        <w:t xml:space="preserve">Open </w:t>
+      </w:r>
+      <w:r>
+        <w:rPr>
+          <w:rFonts w:ascii="Cambria" w:hAnsi="Cambria"/>
+          <w:b/>
+          <w:bCs/>
+          <w:sz w:val="24"/>
+          <w:szCs w:val="24"/>
+        </w:rPr>
+        <w:t>Conda Terminal</w:t>
+      </w:r>
+    </w:p>
+    <w:p>
+      <w:pPr>
+        <w:numPr>
+          <w:ilvl w:val="0"/>
+          <w:numId w:val="42"/>
+        </w:numPr>
+        <w:rPr>
+          <w:rFonts w:ascii="Cambria" w:hAnsi="Cambria"/>
+          <w:sz w:val="24"/>
+          <w:szCs w:val="24"/>
+        </w:rPr>
+      </w:pPr>
+      <w:r>
+        <w:rPr>
+          <w:rFonts w:ascii="Cambria" w:hAnsi="Cambria"/>
+          <w:sz w:val="24"/>
+          <w:szCs w:val="24"/>
+        </w:rPr>
+        <w:t>Create environment:</w:t>
+      </w:r>
+    </w:p>
+    <w:p>
+      <w:pPr>
+        <w:numPr>
+          <w:ilvl w:val="0"/>
+          <w:numId w:val="42"/>
+        </w:numPr>
+        <w:tabs>
+          <w:tab w:val="clear" w:pos="720"/>
+        </w:tabs>
+        <w:rPr>
+          <w:rFonts w:ascii="Cambria" w:hAnsi="Cambria"/>
+          <w:sz w:val="24"/>
+          <w:szCs w:val="24"/>
+        </w:rPr>
+      </w:pPr>
+      <w:proofErr w:type="spellStart"/>
+      <w:r>
+        <w:rPr>
+          <w:rFonts w:ascii="Cambria" w:hAnsi="Cambria"/>
+          <w:sz w:val="24"/>
+          <w:szCs w:val="24"/>
+        </w:rPr>
+        <w:t>conda</w:t>
+      </w:r>
+      <w:proofErr w:type="spellEnd"/>
+      <w:r>
+        <w:rPr>
+          <w:rFonts w:ascii="Cambria" w:hAnsi="Cambria"/>
+          <w:sz w:val="24"/>
+          <w:szCs w:val="24"/>
+        </w:rPr>
+        <w:t xml:space="preserve"> create -n </w:t>
+      </w:r>
+      <w:proofErr w:type="spellStart"/>
+      <w:r>
+        <w:rPr>
+          <w:rFonts w:ascii="Cambria" w:hAnsi="Cambria"/>
+          <w:sz w:val="24"/>
+          <w:szCs w:val="24"/>
+        </w:rPr>
+        <w:t>ml_env</w:t>
+      </w:r>
+      <w:proofErr w:type="spellEnd"/>
+      <w:r>
+        <w:rPr>
+          <w:rFonts w:ascii="Cambria" w:hAnsi="Cambria"/>
+          <w:sz w:val="24"/>
+          <w:szCs w:val="24"/>
+        </w:rPr>
+        <w:t xml:space="preserve"> python=3</w:t>
+      </w:r>
+    </w:p>
+    <w:p>
+      <w:pPr>
+        <w:numPr>
+          <w:ilvl w:val="0"/>
+          <w:numId w:val="42"/>
+        </w:numPr>
+        <w:rPr>
+          <w:rFonts w:ascii="Cambria" w:hAnsi="Cambria"/>
+          <w:sz w:val="24"/>
+          <w:szCs w:val="24"/>
+        </w:rPr>
+      </w:pPr>
+      <w:r>
+        <w:rPr>
+          <w:rFonts w:ascii="Cambria" w:hAnsi="Cambria"/>
+          <w:sz w:val="24"/>
+          <w:szCs w:val="24"/>
+        </w:rPr>
+        <w:t>Activate environment:</w:t>
+      </w:r>
+    </w:p>
+    <w:p>
+      <w:pPr>
+        <w:numPr>
+          <w:ilvl w:val="0"/>
+          <w:numId w:val="42"/>
+        </w:numPr>
+        <w:tabs>
+          <w:tab w:val="clear" w:pos="720"/>
+        </w:tabs>
+        <w:rPr>
+          <w:rFonts w:ascii="Cambria" w:hAnsi="Cambria"/>
+          <w:sz w:val="24"/>
+          <w:szCs w:val="24"/>
+        </w:rPr>
+      </w:pPr>
+      <w:proofErr w:type="spellStart"/>
+      <w:r>
+        <w:rPr>
+          <w:rFonts w:ascii="Cambria" w:hAnsi="Cambria"/>
+          <w:sz w:val="24"/>
+          <w:szCs w:val="24"/>
+        </w:rPr>
+        <w:t>conda</w:t>
+      </w:r>
+      <w:proofErr w:type="spellEnd"/>
+      <w:r>
+        <w:rPr>
+          <w:rFonts w:ascii="Cambria" w:hAnsi="Cambria"/>
+          <w:sz w:val="24"/>
+          <w:szCs w:val="24"/>
+        </w:rPr>
+        <w:t xml:space="preserve"> activate </w:t>
+      </w:r>
+      <w:proofErr w:type="spellStart"/>
+      <w:r>
+        <w:rPr>
+          <w:rFonts w:ascii="Cambria" w:hAnsi="Cambria"/>
+          <w:sz w:val="24"/>
+          <w:szCs w:val="24"/>
+        </w:rPr>
+        <w:t>ml_env</w:t>
+      </w:r>
+      <w:proofErr w:type="spellEnd"/>
+    </w:p>
+    <w:p>
+      <w:pPr>
+        <w:numPr>
+          <w:ilvl w:val="0"/>
+          <w:numId w:val="42"/>
+        </w:numPr>
+        <w:rPr>
+          <w:rFonts w:ascii="Cambria" w:hAnsi="Cambria"/>
+          <w:sz w:val="24"/>
+          <w:szCs w:val="24"/>
+        </w:rPr>
+      </w:pPr>
+      <w:r>
+        <w:rPr>
+          <w:rFonts w:ascii="Cambria" w:hAnsi="Cambria"/>
+          <w:sz w:val="24"/>
+          <w:szCs w:val="24"/>
+        </w:rPr>
+        <w:t xml:space="preserve">Install </w:t>
+      </w:r>
+      <w:proofErr w:type="spellStart"/>
+      <w:r>
+        <w:rPr>
+          <w:rFonts w:ascii="Cambria" w:hAnsi="Cambria"/>
+          <w:sz w:val="24"/>
+          <w:szCs w:val="24"/>
+        </w:rPr>
+        <w:t>Jupyter</w:t>
+      </w:r>
+      <w:proofErr w:type="spellEnd"/>
+      <w:r>
+        <w:rPr>
+          <w:rFonts w:ascii="Cambria" w:hAnsi="Cambria"/>
+          <w:sz w:val="24"/>
+          <w:szCs w:val="24"/>
+        </w:rPr>
+        <w:t>:</w:t>
+      </w:r>
+    </w:p>
+    <w:p>
+      <w:pPr>
+        <w:numPr>
+          <w:ilvl w:val="0"/>
+          <w:numId w:val="42"/>
+        </w:numPr>
+        <w:tabs>
+          <w:tab w:val="clear" w:pos="720"/>
+        </w:tabs>
+        <w:rPr>
+          <w:rFonts w:ascii="Cambria" w:hAnsi="Cambria"/>
+          <w:sz w:val="24"/>
+          <w:szCs w:val="24"/>
+        </w:rPr>
+      </w:pPr>
+      <w:proofErr w:type="spellStart"/>
+      <w:r>
+        <w:rPr>
+          <w:rFonts w:ascii="Cambria" w:hAnsi="Cambria"/>
+          <w:sz w:val="24"/>
+          <w:szCs w:val="24"/>
+        </w:rPr>
+        <w:t>conda</w:t>
+      </w:r>
+      <w:proofErr w:type="spellEnd"/>
+      <w:r>
+        <w:rPr>
+          <w:rFonts w:ascii="Cambria" w:hAnsi="Cambria"/>
+          <w:sz w:val="24"/>
+          <w:szCs w:val="24"/>
+        </w:rPr>
+        <w:t xml:space="preserve"> install </w:t>
+      </w:r>
+      <w:proofErr w:type="spellStart"/>
+      <w:r>
+        <w:rPr>
+          <w:rFonts w:ascii="Cambria" w:hAnsi="Cambria"/>
+          <w:sz w:val="24"/>
+          <w:szCs w:val="24"/>
+        </w:rPr>
+        <w:t>jupyter</w:t>
+      </w:r>
+      <w:proofErr w:type="spellEnd"/>
+    </w:p>
+    <w:p>
+      <w:pPr>
+        <w:numPr>
+          <w:ilvl w:val="0"/>
+          <w:numId w:val="42"/>
+        </w:numPr>
+        <w:rPr>
+          <w:rFonts w:ascii="Cambria" w:hAnsi="Cambria"/>
+          <w:sz w:val="24"/>
+          <w:szCs w:val="24"/>
+        </w:rPr>
+      </w:pPr>
+      <w:r>
+        <w:rPr>
+          <w:rFonts w:ascii="Cambria" w:hAnsi="Cambria"/>
+          <w:sz w:val="24"/>
+          <w:szCs w:val="24"/>
+        </w:rPr>
+        <w:t xml:space="preserve">Start </w:t>
+      </w:r>
+      <w:proofErr w:type="spellStart"/>
+      <w:r>
+        <w:rPr>
+          <w:rFonts w:ascii="Cambria" w:hAnsi="Cambria"/>
+          <w:sz w:val="24"/>
+          <w:szCs w:val="24"/>
+        </w:rPr>
+        <w:t>Jupyter</w:t>
+      </w:r>
+      <w:proofErr w:type="spellEnd"/>
+      <w:r>
+        <w:rPr>
+          <w:rFonts w:ascii="Cambria" w:hAnsi="Cambria"/>
+          <w:sz w:val="24"/>
+          <w:szCs w:val="24"/>
+        </w:rPr>
+        <w:t>:</w:t>
+      </w:r>
+    </w:p>
+    <w:p>
+      <w:pPr>
+        <w:numPr>
+          <w:ilvl w:val="0"/>
+          <w:numId w:val="42"/>
+        </w:numPr>
+        <w:tabs>
+          <w:tab w:val="clear" w:pos="720"/>
+        </w:tabs>
+        <w:rPr>
+          <w:rFonts w:ascii="Cambria" w:hAnsi="Cambria"/>
+          <w:sz w:val="24"/>
+          <w:szCs w:val="24"/>
+        </w:rPr>
+      </w:pPr>
+      <w:proofErr w:type="spellStart"/>
+      <w:r>
+        <w:rPr>
+          <w:rFonts w:ascii="Cambria" w:hAnsi="Cambria"/>
+          <w:sz w:val="24"/>
+          <w:szCs w:val="24"/>
+        </w:rPr>
+        <w:t>jupyter</w:t>
+      </w:r>
+      <w:proofErr w:type="spellEnd"/>
+      <w:r>
+        <w:rPr>
+          <w:rFonts w:ascii="Cambria" w:hAnsi="Cambria"/>
+          <w:sz w:val="24"/>
+          <w:szCs w:val="24"/>
+        </w:rPr>
+        <w:t xml:space="preserve"> notebook</w:t>
+      </w:r>
+    </w:p>
+    <w:p>
+      <w:pPr>
+        <w:pStyle w:val="Heading3"/>
+        <w:rPr>
+          <w:rFonts w:ascii="Cambria" w:hAnsi="Cambria"/>
+          <w:sz w:val="24"/>
+          <w:szCs w:val="24"/>
+        </w:rPr>
+      </w:pPr>
+      <w:r>
+        <w:rPr>
+          <w:rFonts w:ascii="Cambria" w:hAnsi="Cambria"/>
+          <w:sz w:val="24"/>
+          <w:szCs w:val="24"/>
+        </w:rPr>
+        <w:t>Method 3: Using pip</w:t>
+      </w:r>
+    </w:p>
+    <w:p>
+      <w:pPr>
+        <w:numPr>
+          <w:ilvl w:val="0"/>
+          <w:numId w:val="43"/>
+        </w:numPr>
+        <w:rPr>
+          <w:rFonts w:ascii="Cambria" w:hAnsi="Cambria"/>
+          <w:sz w:val="24"/>
+          <w:szCs w:val="24"/>
+        </w:rPr>
+      </w:pPr>
+      <w:r>
+        <w:rPr>
+          <w:rFonts w:ascii="Cambria" w:hAnsi="Cambria"/>
+          <w:sz w:val="24"/>
+          <w:szCs w:val="24"/>
+        </w:rPr>
+        <w:t>Used when Conda is not available</w:t>
+      </w:r>
+    </w:p>
+    <w:p>
+      <w:pPr>
+        <w:pStyle w:val="Heading3"/>
+        <w:rPr>
+          <w:rFonts w:ascii="Cambria" w:hAnsi="Cambria"/>
+          <w:sz w:val="24"/>
+          <w:szCs w:val="24"/>
+        </w:rPr>
+      </w:pPr>
+      <w:r>
+        <w:rPr>
+          <w:rFonts w:ascii="Cambria" w:hAnsi="Cambria"/>
+          <w:sz w:val="24"/>
+          <w:szCs w:val="24"/>
+        </w:rPr>
+        <w:t>Steps:</w:t>
+      </w:r>
+    </w:p>
+    <w:p>
+      <w:pPr>
+        <w:rPr>
+          <w:rFonts w:ascii="Cambria" w:hAnsi="Cambria"/>
+          <w:sz w:val="24"/>
+          <w:szCs w:val="24"/>
+        </w:rPr>
+      </w:pPr>
+      <w:r>
+        <w:rPr>
+          <w:rFonts w:ascii="Cambria" w:hAnsi="Cambria"/>
+          <w:sz w:val="24"/>
+          <w:szCs w:val="24"/>
+        </w:rPr>
+        <w:t>pip install notebook</w:t>
+      </w:r>
+    </w:p>
+    <w:p>
+      <w:pPr>
+        <w:rPr>
+          <w:rFonts w:ascii="Cambria" w:hAnsi="Cambria"/>
+          <w:sz w:val="24"/>
+          <w:szCs w:val="24"/>
+        </w:rPr>
+      </w:pPr>
+      <w:proofErr w:type="spellStart"/>
+      <w:r>
+        <w:rPr>
+          <w:rFonts w:ascii="Cambria" w:hAnsi="Cambria"/>
+          <w:sz w:val="24"/>
+          <w:szCs w:val="24"/>
+        </w:rPr>
+        <w:t>jupyter</w:t>
+      </w:r>
+      <w:proofErr w:type="spellEnd"/>
+      <w:r>
+        <w:rPr>
+          <w:rFonts w:ascii="Cambria" w:hAnsi="Cambria"/>
+          <w:sz w:val="24"/>
+          <w:szCs w:val="24"/>
+        </w:rPr>
+        <w:t xml:space="preserve"> notebook</w:t>
+      </w:r>
+    </w:p>
+    <w:p>
+      <w:pPr>
+        <w:pStyle w:val="Heading2"/>
+        <w:rPr>
+          <w:rFonts w:ascii="Cambria" w:hAnsi="Cambria"/>
+          <w:sz w:val="24"/>
+          <w:szCs w:val="24"/>
+        </w:rPr>
+      </w:pPr>
+      <w:r>
+        <w:rPr>
+          <w:rFonts w:ascii="Cambria" w:hAnsi="Cambria"/>
+          <w:sz w:val="24"/>
+          <w:szCs w:val="24"/>
+        </w:rPr>
+        <w:t xml:space="preserve">Opening </w:t>
+      </w:r>
+      <w:proofErr w:type="spellStart"/>
+      <w:r>
+        <w:rPr>
+          <w:rFonts w:ascii="Cambria" w:hAnsi="Cambria"/>
+          <w:sz w:val="24"/>
+          <w:szCs w:val="24"/>
+        </w:rPr>
+        <w:t>Jupyter</w:t>
+      </w:r>
+      <w:proofErr w:type="spellEnd"/>
+      <w:r>
+        <w:rPr>
+          <w:rFonts w:ascii="Cambria" w:hAnsi="Cambria"/>
+          <w:sz w:val="24"/>
+          <w:szCs w:val="24"/>
+        </w:rPr>
+        <w:t xml:space="preserve"> Notebook</w:t>
+      </w:r>
+    </w:p>
+    <w:p>
+      <w:pPr>
+        <w:numPr>
+          <w:ilvl w:val="0"/>
+          <w:numId w:val="44"/>
+        </w:numPr>
+        <w:rPr>
+          <w:rFonts w:ascii="Cambria" w:hAnsi="Cambria"/>
+          <w:sz w:val="24"/>
+          <w:szCs w:val="24"/>
+        </w:rPr>
+      </w:pPr>
+      <w:r>
+        <w:rPr>
+          <w:rFonts w:ascii="Cambria" w:hAnsi="Cambria"/>
+          <w:sz w:val="24"/>
+          <w:szCs w:val="24"/>
+        </w:rPr>
+        <w:t>A browser window opens automatically</w:t>
+      </w:r>
+    </w:p>
+    <w:p>
+      <w:pPr>
+        <w:numPr>
+          <w:ilvl w:val="0"/>
+          <w:numId w:val="44"/>
+        </w:numPr>
+        <w:rPr>
+          <w:rFonts w:ascii="Cambria" w:hAnsi="Cambria"/>
+          <w:sz w:val="24"/>
+          <w:szCs w:val="24"/>
+        </w:rPr>
+      </w:pPr>
+      <w:r>
+        <w:rPr>
+          <w:rFonts w:ascii="Cambria" w:hAnsi="Cambria"/>
+          <w:sz w:val="24"/>
+          <w:szCs w:val="24"/>
+        </w:rPr>
+        <w:t>Create a new notebook:</w:t>
+      </w:r>
+    </w:p>
+    <w:p>
+      <w:pPr>
+        <w:numPr>
+          <w:ilvl w:val="1"/>
+          <w:numId w:val="44"/>
+        </w:numPr>
+        <w:rPr>
+          <w:rFonts w:ascii="Cambria" w:hAnsi="Cambria"/>
+          <w:sz w:val="24"/>
+          <w:szCs w:val="24"/>
+        </w:rPr>
+      </w:pPr>
+      <w:r>
+        <w:rPr>
+          <w:rFonts w:ascii="Cambria" w:hAnsi="Cambria"/>
+          <w:sz w:val="24"/>
+          <w:szCs w:val="24"/>
+        </w:rPr>
+        <w:t xml:space="preserve">Click </w:t>
+      </w:r>
+      <w:r>
+        <w:rPr>
+          <w:rFonts w:ascii="Cambria" w:hAnsi="Cambria"/>
+          <w:b/>
+          <w:bCs/>
+          <w:sz w:val="24"/>
+          <w:szCs w:val="24"/>
+        </w:rPr>
+        <w:t>New</w:t>
+      </w:r>
+    </w:p>
+    <w:p>
+      <w:pPr>
+        <w:numPr>
+          <w:ilvl w:val="1"/>
+          <w:numId w:val="44"/>
+        </w:numPr>
+        <w:rPr>
+          <w:rFonts w:ascii="Cambria" w:hAnsi="Cambria"/>
+          <w:sz w:val="24"/>
+          <w:szCs w:val="24"/>
+        </w:rPr>
+      </w:pPr>
+      <w:r>
+        <w:rPr>
+          <w:rFonts w:ascii="Cambria" w:hAnsi="Cambria"/>
+          <w:sz w:val="24"/>
+          <w:szCs w:val="24"/>
+        </w:rPr>
+        <w:t xml:space="preserve">Select </w:t>
+      </w:r>
+      <w:r>
+        <w:rPr>
+          <w:rFonts w:ascii="Cambria" w:hAnsi="Cambria"/>
+          <w:b/>
+          <w:bCs/>
+          <w:sz w:val="24"/>
+          <w:szCs w:val="24"/>
+        </w:rPr>
+        <w:t>Python 3</w:t>
+      </w:r>
+    </w:p>
+    <w:p>
+      <w:pPr>
+        <w:pStyle w:val="Heading2"/>
+        <w:rPr>
+          <w:rFonts w:ascii="Cambria" w:hAnsi="Cambria"/>
+          <w:sz w:val="24"/>
+          <w:szCs w:val="24"/>
+        </w:rPr>
+      </w:pPr>
+      <w:r>
+        <w:rPr>
+          <w:rFonts w:ascii="Cambria" w:hAnsi="Cambria"/>
+          <w:sz w:val="24"/>
+          <w:szCs w:val="24"/>
+        </w:rPr>
+        <w:t>Important Points</w:t>
+      </w:r>
+    </w:p>
+    <w:p>
+      <w:pPr>
+        <w:numPr>
+          <w:ilvl w:val="0"/>
+          <w:numId w:val="45"/>
+        </w:numPr>
+        <w:rPr>
+          <w:rFonts w:ascii="Cambria" w:hAnsi="Cambria"/>
+          <w:sz w:val="24"/>
+          <w:szCs w:val="24"/>
+        </w:rPr>
+      </w:pPr>
+      <w:proofErr w:type="spellStart"/>
+      <w:r>
+        <w:rPr>
+          <w:rFonts w:ascii="Cambria" w:hAnsi="Cambria"/>
+          <w:sz w:val="24"/>
+          <w:szCs w:val="24"/>
+        </w:rPr>
+        <w:t>Jupyter</w:t>
+      </w:r>
+      <w:proofErr w:type="spellEnd"/>
+      <w:r>
+        <w:rPr>
+          <w:rFonts w:ascii="Cambria" w:hAnsi="Cambria"/>
+          <w:sz w:val="24"/>
+          <w:szCs w:val="24"/>
+        </w:rPr>
+        <w:t xml:space="preserve"> runs in a </w:t>
+      </w:r>
+      <w:r>
+        <w:rPr>
+          <w:rFonts w:ascii="Cambria" w:hAnsi="Cambria"/>
+          <w:b/>
+          <w:bCs/>
+          <w:sz w:val="24"/>
+          <w:szCs w:val="24"/>
+        </w:rPr>
+        <w:t>browser</w:t>
+      </w:r>
+    </w:p>
+    <w:p>
+      <w:pPr>
+        <w:numPr>
+          <w:ilvl w:val="0"/>
+          <w:numId w:val="45"/>
+        </w:numPr>
+        <w:rPr>
+          <w:rFonts w:ascii="Cambria" w:hAnsi="Cambria"/>
+          <w:sz w:val="24"/>
+          <w:szCs w:val="24"/>
+        </w:rPr>
+      </w:pPr>
+      <w:r>
+        <w:rPr>
+          <w:rFonts w:ascii="Cambria" w:hAnsi="Cambria"/>
+          <w:sz w:val="24"/>
+          <w:szCs w:val="24"/>
+        </w:rPr>
+        <w:t>Files are saved as .</w:t>
+      </w:r>
+      <w:proofErr w:type="spellStart"/>
+      <w:r>
+        <w:rPr>
+          <w:rFonts w:ascii="Cambria" w:hAnsi="Cambria"/>
+          <w:sz w:val="24"/>
+          <w:szCs w:val="24"/>
+        </w:rPr>
+        <w:t>ipynb</w:t>
+      </w:r>
+      <w:proofErr w:type="spellEnd"/>
+    </w:p>
+    <w:p>
+      <w:pPr>
+        <w:numPr>
+          <w:ilvl w:val="0"/>
+          <w:numId w:val="45"/>
+        </w:numPr>
+        <w:rPr>
+          <w:rFonts w:ascii="Cambria" w:hAnsi="Cambria"/>
+          <w:sz w:val="24"/>
+          <w:szCs w:val="24"/>
+        </w:rPr>
+      </w:pPr>
+      <w:r>
+        <w:rPr>
+          <w:rFonts w:ascii="Cambria" w:hAnsi="Cambria"/>
+          <w:sz w:val="24"/>
+          <w:szCs w:val="24"/>
+        </w:rPr>
+        <w:t xml:space="preserve">Each block is called a </w:t>
+      </w:r>
+      <w:r>
+        <w:rPr>
+          <w:rFonts w:ascii="Cambria" w:hAnsi="Cambria"/>
+          <w:b/>
+          <w:bCs/>
+          <w:sz w:val="24"/>
+          <w:szCs w:val="24"/>
+        </w:rPr>
+        <w:t>cell</w:t>
+      </w:r>
+    </w:p>
+    <w:p>
+      <w:pPr>
+        <w:pStyle w:val="Heading2"/>
+        <w:rPr>
+          <w:rFonts w:ascii="Cambria" w:hAnsi="Cambria"/>
+          <w:sz w:val="24"/>
+          <w:szCs w:val="24"/>
+        </w:rPr>
+      </w:pPr>
+      <w:r>
+        <w:rPr>
+          <w:rFonts w:ascii="Cambria" w:hAnsi="Cambria"/>
+          <w:sz w:val="24"/>
+          <w:szCs w:val="24"/>
+        </w:rPr>
+        <w:t>Summary</w:t>
+      </w:r>
+    </w:p>
+    <w:p>
+      <w:pPr>
+        <w:numPr>
+          <w:ilvl w:val="0"/>
+          <w:numId w:val="46"/>
+        </w:numPr>
+        <w:rPr>
+          <w:rFonts w:ascii="Cambria" w:hAnsi="Cambria"/>
+          <w:sz w:val="24"/>
+          <w:szCs w:val="24"/>
+        </w:rPr>
+      </w:pPr>
+      <w:proofErr w:type="spellStart"/>
+      <w:r>
+        <w:rPr>
+          <w:rFonts w:ascii="Cambria" w:hAnsi="Cambria"/>
+          <w:sz w:val="24"/>
+          <w:szCs w:val="24"/>
+        </w:rPr>
+        <w:lastRenderedPageBreak/>
+        <w:t>Jupyter</w:t>
+      </w:r>
+      <w:proofErr w:type="spellEnd"/>
+      <w:r>
+        <w:rPr>
+          <w:rFonts w:ascii="Cambria" w:hAnsi="Cambria"/>
+          <w:sz w:val="24"/>
+          <w:szCs w:val="24"/>
+        </w:rPr>
+        <w:t xml:space="preserve"> Notebook is used for Python, Data Science, and ML</w:t>
+      </w:r>
+    </w:p>
+    <w:p>
+      <w:pPr>
+        <w:numPr>
+          <w:ilvl w:val="0"/>
+          <w:numId w:val="46"/>
+        </w:numPr>
+        <w:rPr>
+          <w:rFonts w:ascii="Cambria" w:hAnsi="Cambria"/>
+          <w:sz w:val="24"/>
+          <w:szCs w:val="24"/>
+        </w:rPr>
+      </w:pPr>
+      <w:r>
+        <w:rPr>
+          <w:rFonts w:ascii="Cambria" w:hAnsi="Cambria"/>
+          <w:sz w:val="24"/>
+          <w:szCs w:val="24"/>
+        </w:rPr>
+        <w:t xml:space="preserve">Best installed using </w:t>
+      </w:r>
+      <w:r>
+        <w:rPr>
+          <w:rFonts w:ascii="Cambria" w:hAnsi="Cambria"/>
+          <w:b/>
+          <w:bCs/>
+          <w:sz w:val="24"/>
+          <w:szCs w:val="24"/>
+        </w:rPr>
+        <w:t xml:space="preserve">Anaconda or </w:t>
+      </w:r>
+      <w:proofErr w:type="spellStart"/>
+      <w:r>
+        <w:rPr>
+          <w:rFonts w:ascii="Cambria" w:hAnsi="Cambria"/>
+          <w:b/>
+          <w:bCs/>
+          <w:sz w:val="24"/>
+          <w:szCs w:val="24"/>
+        </w:rPr>
+        <w:t>Miniconda</w:t>
+      </w:r>
+      <w:proofErr w:type="spellEnd"/>
+    </w:p>
+    <w:p>
+      <w:pPr>
+        <w:numPr>
+          <w:ilvl w:val="0"/>
+          <w:numId w:val="46"/>
+        </w:numPr>
+        <w:rPr>
+          <w:rFonts w:ascii="Cambria" w:hAnsi="Cambria"/>
+          <w:sz w:val="24"/>
+          <w:szCs w:val="24"/>
+        </w:rPr>
+      </w:pPr>
+      <w:r>
+        <w:rPr>
+          <w:rFonts w:ascii="Cambria" w:hAnsi="Cambria"/>
+          <w:sz w:val="24"/>
+          <w:szCs w:val="24"/>
+        </w:rPr>
+        <w:t>Easy to write, run, and test code</w:t>
+      </w:r>
+    </w:p>
+    <w:p>
+      <w:pPr>
+        <w:rPr>
+          <w:rFonts w:ascii="Cambria" w:hAnsi="Cambria"/>
+          <w:sz w:val="24"/>
+          <w:szCs w:val="24"/>
           <w:lang w:val="en-US"/>
         </w:rPr>
       </w:pPr>
@@ -1030,6 +3218,119 @@
     </w:lvl>
   </w:abstractNum>
   <w:abstractNum w:abstractNumId="2" w15:restartNumberingAfterBreak="0">
+    <w:nsid w:val="029D79C9"/>
+    <w:multiLevelType w:val="multilevel"/>
+    <w:tmpl w:val="E6447F84"/>
+    <w:lvl w:ilvl="0">
+      <w:start w:val="1"/>
+      <w:numFmt w:val="decimal"/>
+      <w:lvlText w:val="%1."/>
+      <w:lvlJc w:val="left"/>
+      <w:pPr>
+        <w:tabs>
+          <w:tab w:val="num" w:pos="720"/>
+        </w:tabs>
+        <w:ind w:left="720" w:hanging="360"/>
+      </w:pPr>
+    </w:lvl>
+    <w:lvl w:ilvl="1" w:tentative="1">
+      <w:start w:val="1"/>
+      <w:numFmt w:val="decimal"/>
+      <w:lvlText w:val="%2."/>
+      <w:lvlJc w:val="left"/>
+      <w:pPr>
+        <w:tabs>
+          <w:tab w:val="num" w:pos="1440"/>
+        </w:tabs>
+        <w:ind w:left="1440" w:hanging="360"/>
+      </w:pPr>
+    </w:lvl>
+    <w:lvl w:ilvl="2" w:tentative="1">
+      <w:start w:val="1"/>
+      <w:numFmt w:val="decimal"/>
+      <w:lvlText w:val="%3."/>
+      <w:lvlJc w:val="left"/>
+      <w:pPr>
+        <w:tabs>
+          <w:tab w:val="num" w:pos="2160"/>
+        </w:tabs>
+        <w:ind w:left="2160" w:hanging="360"/>
+      </w:pPr>
+    </w:lvl>
+    <w:lvl w:ilvl="3" w:tentative="1">
+      <w:start w:val="1"/>
+      <w:numFmt w:val="decimal"/>
+      <w:lvlText w:val="%4."/>
+      <w:lvlJc w:val="left"/>
+      <w:pPr>
+        <w:tabs>
+          <w:tab w:val="num" w:pos="2880"/>
+        </w:tabs>
+        <w:ind w:left="2880" w:hanging="360"/>
+      </w:pPr>
+    </w:lvl>
+    <w:lvl w:ilvl="4" w:tentative="1">
+      <w:start w:val="1"/>
+      <w:numFmt w:val="decimal"/>
+      <w:lvlText w:val="%5."/>
+      <w:lvlJc w:val="left"/>
+      <w:pPr>
+        <w:tabs>
+          <w:tab w:val="num" w:pos="3600"/>
+        </w:tabs>
+        <w:ind w:left="3600" w:hanging="360"/>
+      </w:pPr>
+    </w:lvl>
+    <w:lvl w:ilvl="5" w:tentative="1">
+      <w:start w:val="1"/>
+      <w:numFmt w:val="decimal"/>
+      <w:lvlText w:val="%6."/>
+      <w:lvlJc w:val="left"/>
+      <w:pPr>
+        <w:tabs>
+          <w:tab w:val="num" w:pos="4320"/>
+        </w:tabs>
+        <w:ind w:left="4320" w:hanging="360"/>
+      </w:pPr>
+    </w:lvl>
+    <w:lvl w:ilvl="6" w:tentative="1">
+      <w:start w:val="1"/>
+      <w:numFmt w:val="decimal"/>
+      <w:lvlText w:val="%7."/>
+      <w:lvlJc w:val="left"/>
+      <w:pPr>
+        <w:tabs>
+          <w:tab w:val="num" w:pos="5040"/>
+        </w:tabs>
+        <w:ind w:left="5040" w:hanging="360"/>
+      </w:pPr>
+    </w:lvl>
+    <w:lvl w:ilvl="7" w:tentative="1">
+      <w:start w:val="1"/>
+      <w:numFmt w:val="decimal"/>
+      <w:lvlText w:val="%8."/>
+      <w:lvlJc w:val="left"/>
+      <w:pPr>
+        <w:tabs>
+          <w:tab w:val="num" w:pos="5760"/>
+        </w:tabs>
+        <w:ind w:left="5760" w:hanging="360"/>
+      </w:pPr>
+    </w:lvl>
+    <w:lvl w:ilvl="8" w:tentative="1">
+      <w:start w:val="1"/>
+      <w:numFmt w:val="decimal"/>
+      <w:lvlText w:val="%9."/>
+      <w:lvlJc w:val="left"/>
+      <w:pPr>
+        <w:tabs>
+          <w:tab w:val="num" w:pos="6480"/>
+        </w:tabs>
+        <w:ind w:left="6480" w:hanging="360"/>
+      </w:pPr>
+    </w:lvl>
+  </w:abstractNum>
+  <w:abstractNum w:abstractNumId="3" w15:restartNumberingAfterBreak="0">
     <w:nsid w:val="036F604C"/>
     <w:multiLevelType w:val="multilevel"/>
     <w:tmpl w:val="11E6FEE6"/>
@@ -1178,7 +3479,7 @@
       </w:rPr>
     </w:lvl>
   </w:abstractNum>
-  <w:abstractNum w:abstractNumId="3" w15:restartNumberingAfterBreak="0">
+  <w:abstractNum w:abstractNumId="4" w15:restartNumberingAfterBreak="0">
     <w:nsid w:val="07A86D97"/>
     <w:multiLevelType w:val="multilevel"/>
     <w:tmpl w:val="211ECAEA"/>
@@ -1291,7 +3592,156 @@
       </w:pPr>
     </w:lvl>
   </w:abstractNum>
-  <w:abstractNum w:abstractNumId="4" w15:restartNumberingAfterBreak="0">
+  <w:abstractNum w:abstractNumId="5" w15:restartNumberingAfterBreak="0">
+    <w:nsid w:val="07B904C1"/>
+    <w:multiLevelType w:val="multilevel"/>
+    <w:tmpl w:val="1A64B580"/>
+    <w:lvl w:ilvl="0">
+      <w:start w:val="1"/>
+      <w:numFmt w:val="bullet"/>
+      <w:lvlText w:val=""/>
+      <w:lvlJc w:val="left"/>
+      <w:pPr>
+        <w:tabs>
+          <w:tab w:val="num" w:pos="720"/>
+        </w:tabs>
+        <w:ind w:left="720" w:hanging="360"/>
+      </w:pPr>
+      <w:rPr>
+        <w:rFonts w:ascii="Symbol" w:hAnsi="Symbol" w:hint="default"/>
+        <w:sz w:val="20"/>
+      </w:rPr>
+    </w:lvl>
+    <w:lvl w:ilvl="1" w:tentative="1">
+      <w:start w:val="1"/>
+      <w:numFmt w:val="bullet"/>
+      <w:lvlText w:val="o"/>
+      <w:lvlJc w:val="left"/>
+      <w:pPr>
+        <w:tabs>
+          <w:tab w:val="num" w:pos="1440"/>
+        </w:tabs>
+        <w:ind w:left="1440" w:hanging="360"/>
+      </w:pPr>
+      <w:rPr>
+        <w:rFonts w:ascii="Courier New" w:hAnsi="Courier New" w:hint="default"/>
+        <w:sz w:val="20"/>
+      </w:rPr>
+    </w:lvl>
+    <w:lvl w:ilvl="2" w:tentative="1">
+      <w:start w:val="1"/>
+      <w:numFmt w:val="bullet"/>
+      <w:lvlText w:val=""/>
+      <w:lvlJc w:val="left"/>
+      <w:pPr>
+        <w:tabs>
+          <w:tab w:val="num" w:pos="2160"/>
+        </w:tabs>
+        <w:ind w:left="2160" w:hanging="360"/>
+      </w:pPr>
+      <w:rPr>
+        <w:rFonts w:ascii="Wingdings" w:hAnsi="Wingdings" w:hint="default"/>
+        <w:sz w:val="20"/>
+      </w:rPr>
+    </w:lvl>
+    <w:lvl w:ilvl="3" w:tentative="1">
+      <w:start w:val="1"/>
+      <w:numFmt w:val="bullet"/>
+      <w:lvlText w:val=""/>
+      <w:lvlJc w:val="left"/>
+      <w:pPr>
+        <w:tabs>
+          <w:tab w:val="num" w:pos="2880"/>
+        </w:tabs>
+        <w:ind w:left="2880" w:hanging="360"/>
+      </w:pPr>
+      <w:rPr>
+        <w:rFonts w:ascii="Wingdings" w:hAnsi="Wingdings" w:hint="default"/>
+        <w:sz w:val="20"/>
+      </w:rPr>
+    </w:lvl>
+    <w:lvl w:ilvl="4" w:tentative="1">
+      <w:start w:val="1"/>
+      <w:numFmt w:val="bullet"/>
+      <w:lvlText w:val=""/>
+      <w:lvlJc w:val="left"/>
+      <w:pPr>
+        <w:tabs>
+          <w:tab w:val="num" w:pos="3600"/>
+        </w:tabs>
+        <w:ind w:left="3600" w:hanging="360"/>
+      </w:pPr>
+      <w:rPr>
+        <w:rFonts w:ascii="Wingdings" w:hAnsi="Wingdings" w:hint="default"/>
+        <w:sz w:val="20"/>
+      </w:rPr>
+    </w:lvl>
+    <w:lvl w:ilvl="5" w:tentative="1">
+      <w:start w:val="1"/>
+      <w:numFmt w:val="bullet"/>
+      <w:lvlText w:val=""/>
+      <w:lvlJc w:val="left"/>
+      <w:pPr>
+        <w:tabs>
+          <w:tab w:val="num" w:pos="4320"/>
+        </w:tabs>
+        <w:ind w:left="4320" w:hanging="360"/>
+      </w:pPr>
+      <w:rPr>
+        <w:rFonts w:ascii="Wingdings" w:hAnsi="Wingdings" w:hint="default"/>
+        <w:sz w:val="20"/>
+      </w:rPr>
+    </w:lvl>
+    <w:lvl w:ilvl="6" w:tentative="1">
+      <w:start w:val="1"/>
+      <w:numFmt w:val="bullet"/>
+      <w:lvlText w:val=""/>
+      <w:lvlJc w:val="left"/>
+      <w:pPr>
+        <w:tabs>
+          <w:tab w:val="num" w:pos="5040"/>
+        </w:tabs>
+        <w:ind w:left="5040" w:hanging="360"/>
+      </w:pPr>
+      <w:rPr>
+        <w:rFonts w:ascii="Wingdings" w:hAnsi="Wingdings" w:hint="default"/>
+        <w:sz w:val="20"/>
+      </w:rPr>
+    </w:lvl>
+    <w:lvl w:ilvl="7" w:tentative="1">
+      <w:start w:val="1"/>
+      <w:numFmt w:val="bullet"/>
+      <w:lvlText w:val=""/>
+      <w:lvlJc w:val="left"/>
+      <w:pPr>
+        <w:tabs>
+          <w:tab w:val="num" w:pos="5760"/>
+        </w:tabs>
+        <w:ind w:left="5760" w:hanging="360"/>
+      </w:pPr>
+      <w:rPr>
+        <w:rFonts w:ascii="Wingdings" w:hAnsi="Wingdings" w:hint="default"/>
+        <w:sz w:val="20"/>
+      </w:rPr>
+    </w:lvl>
+    <w:lvl w:ilvl="8" w:tentative="1">
+      <w:start w:val="1"/>
+      <w:numFmt w:val="bullet"/>
+      <w:lvlText w:val=""/>
+      <w:lvlJc w:val="left"/>
+      <w:pPr>
+        <w:tabs>
+          <w:tab w:val="num" w:pos="6480"/>
+        </w:tabs>
+        <w:ind w:left="6480" w:hanging="360"/>
+      </w:pPr>
+      <w:rPr>
+        <w:rFonts w:ascii="Wingdings" w:hAnsi="Wingdings" w:hint="default"/>
+        <w:sz w:val="20"/>
+      </w:rPr>
+    </w:lvl>
+  </w:abstractNum>
+  <w:abstractNum w:abstractNumId="6" w15:restartNumberingAfterBreak="0">
     <w:nsid w:val="08C35A7C"/>
     <w:multiLevelType w:val="multilevel"/>
     <w:tmpl w:val="3E54822E"/>
@@ -1440,7 +3890,7 @@
       </w:rPr>
     </w:lvl>
   </w:abstractNum>
-  <w:abstractNum w:abstractNumId="5" w15:restartNumberingAfterBreak="0">
+  <w:abstractNum w:abstractNumId="7" w15:restartNumberingAfterBreak="0">
     <w:nsid w:val="0D0764BB"/>
     <w:multiLevelType w:val="multilevel"/>
     <w:tmpl w:val="559833AE"/>
@@ -1589,7 +4039,7 @@
       </w:rPr>
     </w:lvl>
   </w:abstractNum>
-  <w:abstractNum w:abstractNumId="6" w15:restartNumberingAfterBreak="0">
+  <w:abstractNum w:abstractNumId="8" w15:restartNumberingAfterBreak="0">
     <w:nsid w:val="138A43B3"/>
     <w:multiLevelType w:val="multilevel"/>
     <w:tmpl w:val="BBB22260"/>
@@ -1738,7 +4188,269 @@
       </w:rPr>
     </w:lvl>
   </w:abstractNum>
-  <w:abstractNum w:abstractNumId="7" w15:restartNumberingAfterBreak="0">
+  <w:abstractNum w:abstractNumId="9" w15:restartNumberingAfterBreak="0">
+    <w:nsid w:val="162B26E9"/>
+    <w:multiLevelType w:val="multilevel"/>
+    <w:tmpl w:val="FEC0D5B6"/>
+    <w:lvl w:ilvl="0">
+      <w:start w:val="1"/>
+      <w:numFmt w:val="bullet"/>
+      <w:lvlText w:val=""/>
+      <w:lvlJc w:val="left"/>
+      <w:pPr>
+        <w:tabs>
+          <w:tab w:val="num" w:pos="720"/>
+        </w:tabs>
+        <w:ind w:left="720" w:hanging="360"/>
+      </w:pPr>
+      <w:rPr>
+        <w:rFonts w:ascii="Symbol" w:hAnsi="Symbol" w:hint="default"/>
+        <w:sz w:val="20"/>
+      </w:rPr>
+    </w:lvl>
+    <w:lvl w:ilvl="1" w:tentative="1">
+      <w:start w:val="1"/>
+      <w:numFmt w:val="bullet"/>
+      <w:lvlText w:val="o"/>
+      <w:lvlJc w:val="left"/>
+      <w:pPr>
+        <w:tabs>
+          <w:tab w:val="num" w:pos="1440"/>
+        </w:tabs>
+        <w:ind w:left="1440" w:hanging="360"/>
+      </w:pPr>
+      <w:rPr>
+        <w:rFonts w:ascii="Courier New" w:hAnsi="Courier New" w:hint="default"/>
+        <w:sz w:val="20"/>
+      </w:rPr>
+    </w:lvl>
+    <w:lvl w:ilvl="2" w:tentative="1">
+      <w:start w:val="1"/>
+      <w:numFmt w:val="bullet"/>
+      <w:lvlText w:val=""/>
+      <w:lvlJc w:val="left"/>
+      <w:pPr>
+        <w:tabs>
+          <w:tab w:val="num" w:pos="2160"/>
+        </w:tabs>
+        <w:ind w:left="2160" w:hanging="360"/>
+      </w:pPr>
+      <w:rPr>
+        <w:rFonts w:ascii="Wingdings" w:hAnsi="Wingdings" w:hint="default"/>
+        <w:sz w:val="20"/>
+      </w:rPr>
+    </w:lvl>
+    <w:lvl w:ilvl="3" w:tentative="1">
+      <w:start w:val="1"/>
+      <w:numFmt w:val="bullet"/>
+      <w:lvlText w:val=""/>
+      <w:lvlJc w:val="left"/>
+      <w:pPr>
+        <w:tabs>
+          <w:tab w:val="num" w:pos="2880"/>
+        </w:tabs>
+        <w:ind w:left="2880" w:hanging="360"/>
+      </w:pPr>
+      <w:rPr>
+        <w:rFonts w:ascii="Wingdings" w:hAnsi="Wingdings" w:hint="default"/>
+        <w:sz w:val="20"/>
+      </w:rPr>
+    </w:lvl>
+    <w:lvl w:ilvl="4" w:tentative="1">
+      <w:start w:val="1"/>
+      <w:numFmt w:val="bullet"/>
+      <w:lvlText w:val=""/>
+      <w:lvlJc w:val="left"/>
+      <w:pPr>
+        <w:tabs>
+          <w:tab w:val="num" w:pos="3600"/>
+        </w:tabs>
+        <w:ind w:left="3600" w:hanging="360"/>
+      </w:pPr>
+      <w:rPr>
+        <w:rFonts w:ascii="Wingdings" w:hAnsi="Wingdings" w:hint="default"/>
+        <w:sz w:val="20"/>
+      </w:rPr>
+    </w:lvl>
+    <w:lvl w:ilvl="5" w:tentative="1">
+      <w:start w:val="1"/>
+      <w:numFmt w:val="bullet"/>
+      <w:lvlText w:val=""/>
+      <w:lvlJc w:val="left"/>
+      <w:pPr>
+        <w:tabs>
+          <w:tab w:val="num" w:pos="4320"/>
+        </w:tabs>
+        <w:ind w:left="4320" w:hanging="360"/>
+      </w:pPr>
+      <w:rPr>
+        <w:rFonts w:ascii="Wingdings" w:hAnsi="Wingdings" w:hint="default"/>
+        <w:sz w:val="20"/>
+      </w:rPr>
+    </w:lvl>
+    <w:lvl w:ilvl="6" w:tentative="1">
+      <w:start w:val="1"/>
+      <w:numFmt w:val="bullet"/>
+      <w:lvlText w:val=""/>
+      <w:lvlJc w:val="left"/>
+      <w:pPr>
+        <w:tabs>
+          <w:tab w:val="num" w:pos="5040"/>
+        </w:tabs>
+        <w:ind w:left="5040" w:hanging="360"/>
+      </w:pPr>
+      <w:rPr>
+        <w:rFonts w:ascii="Wingdings" w:hAnsi="Wingdings" w:hint="default"/>
+        <w:sz w:val="20"/>
+      </w:rPr>
+    </w:lvl>
+    <w:lvl w:ilvl="7" w:tentative="1">
+      <w:start w:val="1"/>
+      <w:numFmt w:val="bullet"/>
+      <w:lvlText w:val=""/>
+      <w:lvlJc w:val="left"/>
+      <w:pPr>
+        <w:tabs>
+          <w:tab w:val="num" w:pos="5760"/>
+        </w:tabs>
+        <w:ind w:left="5760" w:hanging="360"/>
+      </w:pPr>
+      <w:rPr>
+        <w:rFonts w:ascii="Wingdings" w:hAnsi="Wingdings" w:hint="default"/>
+        <w:sz w:val="20"/>
+      </w:rPr>
+    </w:lvl>
+    <w:lvl w:ilvl="8" w:tentative="1">
+      <w:start w:val="1"/>
+      <w:numFmt w:val="bullet"/>
+      <w:lvlText w:val=""/>
+      <w:lvlJc w:val="left"/>
+      <w:pPr>
+        <w:tabs>
+          <w:tab w:val="num" w:pos="6480"/>
+        </w:tabs>
+        <w:ind w:left="6480" w:hanging="360"/>
+      </w:pPr>
+      <w:rPr>
+        <w:rFonts w:ascii="Wingdings" w:hAnsi="Wingdings" w:hint="default"/>
+        <w:sz w:val="20"/>
+      </w:rPr>
+    </w:lvl>
+  </w:abstractNum>
+  <w:abstractNum w:abstractNumId="10" w15:restartNumberingAfterBreak="0">
+    <w:nsid w:val="16946E5C"/>
+    <w:multiLevelType w:val="multilevel"/>
+    <w:tmpl w:val="1334FA8A"/>
+    <w:lvl w:ilvl="0">
+      <w:start w:val="1"/>
+      <w:numFmt w:val="decimal"/>
+      <w:lvlText w:val="%1."/>
+      <w:lvlJc w:val="left"/>
+      <w:pPr>
+        <w:tabs>
+          <w:tab w:val="num" w:pos="720"/>
+        </w:tabs>
+        <w:ind w:left="720" w:hanging="360"/>
+      </w:pPr>
+    </w:lvl>
+    <w:lvl w:ilvl="1" w:tentative="1">
+      <w:start w:val="1"/>
+      <w:numFmt w:val="decimal"/>
+      <w:lvlText w:val="%2."/>
+      <w:lvlJc w:val="left"/>
+      <w:pPr>
+        <w:tabs>
+          <w:tab w:val="num" w:pos="1440"/>
+        </w:tabs>
+        <w:ind w:left="1440" w:hanging="360"/>
+      </w:pPr>
+    </w:lvl>
+    <w:lvl w:ilvl="2" w:tentative="1">
+      <w:start w:val="1"/>
+      <w:numFmt w:val="decimal"/>
+      <w:lvlText w:val="%3."/>
+      <w:lvlJc w:val="left"/>
+      <w:pPr>
+        <w:tabs>
+          <w:tab w:val="num" w:pos="2160"/>
+        </w:tabs>
+        <w:ind w:left="2160" w:hanging="360"/>
+      </w:pPr>
+    </w:lvl>
+    <w:lvl w:ilvl="3" w:tentative="1">
+      <w:start w:val="1"/>
+      <w:numFmt w:val="decimal"/>
+      <w:lvlText w:val="%4."/>
+      <w:lvlJc w:val="left"/>
+      <w:pPr>
+        <w:tabs>
+          <w:tab w:val="num" w:pos="2880"/>
+        </w:tabs>
+        <w:ind w:left="2880" w:hanging="360"/>
+      </w:pPr>
+    </w:lvl>
+    <w:lvl w:ilvl="4" w:tentative="1">
+      <w:start w:val="1"/>
+      <w:numFmt w:val="decimal"/>
+      <w:lvlText w:val="%5."/>
+      <w:lvlJc w:val="left"/>
+      <w:pPr>
+        <w:tabs>
+          <w:tab w:val="num" w:pos="3600"/>
+        </w:tabs>
+        <w:ind w:left="3600" w:hanging="360"/>
+      </w:pPr>
+    </w:lvl>
+    <w:lvl w:ilvl="5" w:tentative="1">
+      <w:start w:val="1"/>
+      <w:numFmt w:val="decimal"/>
+      <w:lvlText w:val="%6."/>
+      <w:lvlJc w:val="left"/>
+      <w:pPr>
+        <w:tabs>
+          <w:tab w:val="num" w:pos="4320"/>
+        </w:tabs>
+        <w:ind w:left="4320" w:hanging="360"/>
+      </w:pPr>
+    </w:lvl>
+    <w:lvl w:ilvl="6" w:tentative="1">
+      <w:start w:val="1"/>
+      <w:numFmt w:val="decimal"/>
+      <w:lvlText w:val="%7."/>
+      <w:lvlJc w:val="left"/>
+      <w:pPr>
+        <w:tabs>
+          <w:tab w:val="num" w:pos="5040"/>
+        </w:tabs>
+        <w:ind w:left="5040" w:hanging="360"/>
+      </w:pPr>
+    </w:lvl>
+    <w:lvl w:ilvl="7" w:tentative="1">
+      <w:start w:val="1"/>
+      <w:numFmt w:val="decimal"/>
+      <w:lvlText w:val="%8."/>
+      <w:lvlJc w:val="left"/>
+      <w:pPr>
+        <w:tabs>
+          <w:tab w:val="num" w:pos="5760"/>
+        </w:tabs>
+        <w:ind w:left="5760" w:hanging="360"/>
+      </w:pPr>
+    </w:lvl>
+    <w:lvl w:ilvl="8" w:tentative="1">
+      <w:start w:val="1"/>
+      <w:numFmt w:val="decimal"/>
+      <w:lvlText w:val="%9."/>
+      <w:lvlJc w:val="left"/>
+      <w:pPr>
+        <w:tabs>
+          <w:tab w:val="num" w:pos="6480"/>
+        </w:tabs>
+        <w:ind w:left="6480" w:hanging="360"/>
+      </w:pPr>
+    </w:lvl>
+  </w:abstractNum>
+  <w:abstractNum w:abstractNumId="11" w15:restartNumberingAfterBreak="0">
     <w:nsid w:val="16986D98"/>
     <w:multiLevelType w:val="multilevel"/>
     <w:tmpl w:val="7AA47D30"/>
@@ -1851,7 +4563,7 @@
       </w:pPr>
     </w:lvl>
   </w:abstractNum>
-  <w:abstractNum w:abstractNumId="8" w15:restartNumberingAfterBreak="0">
+  <w:abstractNum w:abstractNumId="12" w15:restartNumberingAfterBreak="0">
     <w:nsid w:val="17135730"/>
     <w:multiLevelType w:val="multilevel"/>
     <w:tmpl w:val="3EFEE4E8"/>
@@ -1964,7 +4676,7 @@
       </w:pPr>
     </w:lvl>
   </w:abstractNum>
-  <w:abstractNum w:abstractNumId="9" w15:restartNumberingAfterBreak="0">
+  <w:abstractNum w:abstractNumId="13" w15:restartNumberingAfterBreak="0">
     <w:nsid w:val="1A404990"/>
     <w:multiLevelType w:val="multilevel"/>
     <w:tmpl w:val="B922EF98"/>
@@ -2113,7 +4825,7 @@
       </w:rPr>
     </w:lvl>
   </w:abstractNum>
-  <w:abstractNum w:abstractNumId="10" w15:restartNumberingAfterBreak="0">
+  <w:abstractNum w:abstractNumId="14" w15:restartNumberingAfterBreak="0">
     <w:nsid w:val="1B9A0C29"/>
     <w:multiLevelType w:val="multilevel"/>
     <w:tmpl w:val="75EE9222"/>
@@ -2262,7 +4974,7 @@
       </w:rPr>
     </w:lvl>
   </w:abstractNum>
-  <w:abstractNum w:abstractNumId="11" w15:restartNumberingAfterBreak="0">
+  <w:abstractNum w:abstractNumId="15" w15:restartNumberingAfterBreak="0">
     <w:nsid w:val="1D1F679A"/>
     <w:multiLevelType w:val="multilevel"/>
     <w:tmpl w:val="872882B4"/>
@@ -2411,7 +5123,7 @@
       </w:rPr>
     </w:lvl>
   </w:abstractNum>
-  <w:abstractNum w:abstractNumId="12" w15:restartNumberingAfterBreak="0">
+  <w:abstractNum w:abstractNumId="16" w15:restartNumberingAfterBreak="0">
     <w:nsid w:val="208831D8"/>
     <w:multiLevelType w:val="multilevel"/>
     <w:tmpl w:val="B6CC275A"/>
@@ -2528,7 +5240,7 @@
       </w:pPr>
     </w:lvl>
   </w:abstractNum>
-  <w:abstractNum w:abstractNumId="13" w15:restartNumberingAfterBreak="0">
+  <w:abstractNum w:abstractNumId="17" w15:restartNumberingAfterBreak="0">
     <w:nsid w:val="22EB3BFA"/>
     <w:multiLevelType w:val="multilevel"/>
     <w:tmpl w:val="664249B4"/>
@@ -2641,7 +5353,7 @@
       </w:pPr>
     </w:lvl>
   </w:abstractNum>
-  <w:abstractNum w:abstractNumId="14" w15:restartNumberingAfterBreak="0">
+  <w:abstractNum w:abstractNumId="18" w15:restartNumberingAfterBreak="0">
     <w:nsid w:val="23AF3784"/>
     <w:multiLevelType w:val="multilevel"/>
     <w:tmpl w:val="2116A9B8"/>
@@ -2790,7 +5502,7 @@
       </w:rPr>
     </w:lvl>
   </w:abstractNum>
-  <w:abstractNum w:abstractNumId="15" w15:restartNumberingAfterBreak="0">
+  <w:abstractNum w:abstractNumId="19" w15:restartNumberingAfterBreak="0">
     <w:nsid w:val="2E466AD5"/>
     <w:multiLevelType w:val="multilevel"/>
     <w:tmpl w:val="6512FEDA"/>
@@ -2939,7 +5651,7 @@
       </w:rPr>
     </w:lvl>
   </w:abstractNum>
-  <w:abstractNum w:abstractNumId="16" w15:restartNumberingAfterBreak="0">
+  <w:abstractNum w:abstractNumId="20" w15:restartNumberingAfterBreak="0">
     <w:nsid w:val="3240775B"/>
     <w:multiLevelType w:val="multilevel"/>
     <w:tmpl w:val="75F0EA36"/>
@@ -3052,7 +5764,7 @@
       </w:pPr>
     </w:lvl>
   </w:abstractNum>
-  <w:abstractNum w:abstractNumId="17" w15:restartNumberingAfterBreak="0">
+  <w:abstractNum w:abstractNumId="21" w15:restartNumberingAfterBreak="0">
     <w:nsid w:val="39884EF8"/>
     <w:multiLevelType w:val="multilevel"/>
     <w:tmpl w:val="6F988E00"/>
@@ -3165,7 +5877,7 @@
       </w:pPr>
     </w:lvl>
   </w:abstractNum>
-  <w:abstractNum w:abstractNumId="18" w15:restartNumberingAfterBreak="0">
+  <w:abstractNum w:abstractNumId="22" w15:restartNumberingAfterBreak="0">
     <w:nsid w:val="3B434317"/>
     <w:multiLevelType w:val="multilevel"/>
     <w:tmpl w:val="3C7E2F8E"/>
@@ -3314,7 +6026,7 @@
       </w:rPr>
     </w:lvl>
   </w:abstractNum>
-  <w:abstractNum w:abstractNumId="19" w15:restartNumberingAfterBreak="0">
+  <w:abstractNum w:abstractNumId="23" w15:restartNumberingAfterBreak="0">
     <w:nsid w:val="3DB0446D"/>
     <w:multiLevelType w:val="multilevel"/>
     <w:tmpl w:val="76CCE384"/>
@@ -3463,7 +6175,7 @@
       </w:rPr>
     </w:lvl>
   </w:abstractNum>
-  <w:abstractNum w:abstractNumId="20" w15:restartNumberingAfterBreak="0">
+  <w:abstractNum w:abstractNumId="24" w15:restartNumberingAfterBreak="0">
     <w:nsid w:val="3EDD58DF"/>
     <w:multiLevelType w:val="multilevel"/>
     <w:tmpl w:val="6BE48460"/>
@@ -3612,7 +6324,7 @@
       </w:rPr>
     </w:lvl>
   </w:abstractNum>
-  <w:abstractNum w:abstractNumId="21" w15:restartNumberingAfterBreak="0">
+  <w:abstractNum w:abstractNumId="25" w15:restartNumberingAfterBreak="0">
     <w:nsid w:val="459E70ED"/>
     <w:multiLevelType w:val="multilevel"/>
     <w:tmpl w:val="22F0A5C0"/>
@@ -3761,7 +6473,7 @@
       </w:rPr>
     </w:lvl>
   </w:abstractNum>
-  <w:abstractNum w:abstractNumId="22" w15:restartNumberingAfterBreak="0">
+  <w:abstractNum w:abstractNumId="26" w15:restartNumberingAfterBreak="0">
     <w:nsid w:val="47746C0E"/>
     <w:multiLevelType w:val="multilevel"/>
     <w:tmpl w:val="40F2D2F4"/>
@@ -3910,7 +6622,7 @@
       </w:rPr>
     </w:lvl>
   </w:abstractNum>
-  <w:abstractNum w:abstractNumId="23" w15:restartNumberingAfterBreak="0">
+  <w:abstractNum w:abstractNumId="27" w15:restartNumberingAfterBreak="0">
     <w:nsid w:val="4B682716"/>
     <w:multiLevelType w:val="multilevel"/>
     <w:tmpl w:val="5AD8A0E2"/>
@@ -4059,7 +6771,156 @@
       </w:rPr>
     </w:lvl>
   </w:abstractNum>
-  <w:abstractNum w:abstractNumId="24" w15:restartNumberingAfterBreak="0">
+  <w:abstractNum w:abstractNumId="28" w15:restartNumberingAfterBreak="0">
+    <w:nsid w:val="4D8828D4"/>
+    <w:multiLevelType w:val="multilevel"/>
+    <w:tmpl w:val="0FCEB732"/>
+    <w:lvl w:ilvl="0">
+      <w:start w:val="1"/>
+      <w:numFmt w:val="bullet"/>
+      <w:lvlText w:val=""/>
+      <w:lvlJc w:val="left"/>
+      <w:pPr>
+        <w:tabs>
+          <w:tab w:val="num" w:pos="720"/>
+        </w:tabs>
+        <w:ind w:left="720" w:hanging="360"/>
+      </w:pPr>
+      <w:rPr>
+        <w:rFonts w:ascii="Symbol" w:hAnsi="Symbol" w:hint="default"/>
+        <w:sz w:val="20"/>
+      </w:rPr>
+    </w:lvl>
+    <w:lvl w:ilvl="1">
+      <w:start w:val="1"/>
+      <w:numFmt w:val="bullet"/>
+      <w:lvlText w:val="o"/>
+      <w:lvlJc w:val="left"/>
+      <w:pPr>
+        <w:tabs>
+          <w:tab w:val="num" w:pos="1440"/>
+        </w:tabs>
+        <w:ind w:left="1440" w:hanging="360"/>
+      </w:pPr>
+      <w:rPr>
+        <w:rFonts w:ascii="Courier New" w:hAnsi="Courier New" w:hint="default"/>
+        <w:sz w:val="20"/>
+      </w:rPr>
+    </w:lvl>
+    <w:lvl w:ilvl="2" w:tentative="1">
+      <w:start w:val="1"/>
+      <w:numFmt w:val="bullet"/>
+      <w:lvlText w:val=""/>
+      <w:lvlJc w:val="left"/>
+      <w:pPr>
+        <w:tabs>
+          <w:tab w:val="num" w:pos="2160"/>
+        </w:tabs>
+        <w:ind w:left="2160" w:hanging="360"/>
+      </w:pPr>
+      <w:rPr>
+        <w:rFonts w:ascii="Wingdings" w:hAnsi="Wingdings" w:hint="default"/>
+        <w:sz w:val="20"/>
+      </w:rPr>
+    </w:lvl>
+    <w:lvl w:ilvl="3" w:tentative="1">
+      <w:start w:val="1"/>
+      <w:numFmt w:val="bullet"/>
+      <w:lvlText w:val=""/>
+      <w:lvlJc w:val="left"/>
+      <w:pPr>
+        <w:tabs>
+          <w:tab w:val="num" w:pos="2880"/>
+        </w:tabs>
+        <w:ind w:left="2880" w:hanging="360"/>
+      </w:pPr>
+      <w:rPr>
+        <w:rFonts w:ascii="Wingdings" w:hAnsi="Wingdings" w:hint="default"/>
+        <w:sz w:val="20"/>
+      </w:rPr>
+    </w:lvl>
+    <w:lvl w:ilvl="4" w:tentative="1">
+      <w:start w:val="1"/>
+      <w:numFmt w:val="bullet"/>
+      <w:lvlText w:val=""/>
+      <w:lvlJc w:val="left"/>
+      <w:pPr>
+        <w:tabs>
+          <w:tab w:val="num" w:pos="3600"/>
+        </w:tabs>
+        <w:ind w:left="3600" w:hanging="360"/>
+      </w:pPr>
+      <w:rPr>
+        <w:rFonts w:ascii="Wingdings" w:hAnsi="Wingdings" w:hint="default"/>
+        <w:sz w:val="20"/>
+      </w:rPr>
+    </w:lvl>
+    <w:lvl w:ilvl="5" w:tentative="1">
+      <w:start w:val="1"/>
+      <w:numFmt w:val="bullet"/>
+      <w:lvlText w:val=""/>
+      <w:lvlJc w:val="left"/>
+      <w:pPr>
+        <w:tabs>
+          <w:tab w:val="num" w:pos="4320"/>
+        </w:tabs>
+        <w:ind w:left="4320" w:hanging="360"/>
+      </w:pPr>
+      <w:rPr>
+        <w:rFonts w:ascii="Wingdings" w:hAnsi="Wingdings" w:hint="default"/>
+        <w:sz w:val="20"/>
+      </w:rPr>
+    </w:lvl>
+    <w:lvl w:ilvl="6" w:tentative="1">
+      <w:start w:val="1"/>
+      <w:numFmt w:val="bullet"/>
+      <w:lvlText w:val=""/>
+      <w:lvlJc w:val="left"/>
+      <w:pPr>
+        <w:tabs>
+          <w:tab w:val="num" w:pos="5040"/>
+        </w:tabs>
+        <w:ind w:left="5040" w:hanging="360"/>
+      </w:pPr>
+      <w:rPr>
+        <w:rFonts w:ascii="Wingdings" w:hAnsi="Wingdings" w:hint="default"/>
+        <w:sz w:val="20"/>
+      </w:rPr>
+    </w:lvl>
+    <w:lvl w:ilvl="7" w:tentative="1">
+      <w:start w:val="1"/>
+      <w:numFmt w:val="bullet"/>
+      <w:lvlText w:val=""/>
+      <w:lvlJc w:val="left"/>
+      <w:pPr>
+        <w:tabs>
+          <w:tab w:val="num" w:pos="5760"/>
+        </w:tabs>
+        <w:ind w:left="5760" w:hanging="360"/>
+      </w:pPr>
+      <w:rPr>
+        <w:rFonts w:ascii="Wingdings" w:hAnsi="Wingdings" w:hint="default"/>
+        <w:sz w:val="20"/>
+      </w:rPr>
+    </w:lvl>
+    <w:lvl w:ilvl="8" w:tentative="1">
+      <w:start w:val="1"/>
+      <w:numFmt w:val="bullet"/>
+      <w:lvlText w:val=""/>
+      <w:lvlJc w:val="left"/>
+      <w:pPr>
+        <w:tabs>
+          <w:tab w:val="num" w:pos="6480"/>
+        </w:tabs>
+        <w:ind w:left="6480" w:hanging="360"/>
+      </w:pPr>
+      <w:rPr>
+        <w:rFonts w:ascii="Wingdings" w:hAnsi="Wingdings" w:hint="default"/>
+        <w:sz w:val="20"/>
+      </w:rPr>
+    </w:lvl>
+  </w:abstractNum>
+  <w:abstractNum w:abstractNumId="29" w15:restartNumberingAfterBreak="0">
     <w:nsid w:val="4F053ECF"/>
     <w:multiLevelType w:val="multilevel"/>
     <w:tmpl w:val="747C4C96"/>
@@ -4208,7 +7069,156 @@
       </w:rPr>
     </w:lvl>
   </w:abstractNum>
-  <w:abstractNum w:abstractNumId="25" w15:restartNumberingAfterBreak="0">
+  <w:abstractNum w:abstractNumId="30" w15:restartNumberingAfterBreak="0">
+    <w:nsid w:val="4FA543EA"/>
+    <w:multiLevelType w:val="multilevel"/>
+    <w:tmpl w:val="4C68BF38"/>
+    <w:lvl w:ilvl="0">
+      <w:start w:val="1"/>
+      <w:numFmt w:val="bullet"/>
+      <w:lvlText w:val=""/>
+      <w:lvlJc w:val="left"/>
+      <w:pPr>
+        <w:tabs>
+          <w:tab w:val="num" w:pos="720"/>
+        </w:tabs>
+        <w:ind w:left="720" w:hanging="360"/>
+      </w:pPr>
+      <w:rPr>
+        <w:rFonts w:ascii="Symbol" w:hAnsi="Symbol" w:hint="default"/>
+        <w:sz w:val="20"/>
+      </w:rPr>
+    </w:lvl>
+    <w:lvl w:ilvl="1" w:tentative="1">
+      <w:start w:val="1"/>
+      <w:numFmt w:val="bullet"/>
+      <w:lvlText w:val="o"/>
+      <w:lvlJc w:val="left"/>
+      <w:pPr>
+        <w:tabs>
+          <w:tab w:val="num" w:pos="1440"/>
+        </w:tabs>
+        <w:ind w:left="1440" w:hanging="360"/>
+      </w:pPr>
+      <w:rPr>
+        <w:rFonts w:ascii="Courier New" w:hAnsi="Courier New" w:hint="default"/>
+        <w:sz w:val="20"/>
+      </w:rPr>
+    </w:lvl>
+    <w:lvl w:ilvl="2" w:tentative="1">
+      <w:start w:val="1"/>
+      <w:numFmt w:val="bullet"/>
+      <w:lvlText w:val=""/>
+      <w:lvlJc w:val="left"/>
+      <w:pPr>
+        <w:tabs>
+          <w:tab w:val="num" w:pos="2160"/>
+        </w:tabs>
+        <w:ind w:left="2160" w:hanging="360"/>
+      </w:pPr>
+      <w:rPr>
+        <w:rFonts w:ascii="Wingdings" w:hAnsi="Wingdings" w:hint="default"/>
+        <w:sz w:val="20"/>
+      </w:rPr>
+    </w:lvl>
+    <w:lvl w:ilvl="3" w:tentative="1">
+      <w:start w:val="1"/>
+      <w:numFmt w:val="bullet"/>
+      <w:lvlText w:val=""/>
+      <w:lvlJc w:val="left"/>
+      <w:pPr>
+        <w:tabs>
+          <w:tab w:val="num" w:pos="2880"/>
+        </w:tabs>
+        <w:ind w:left="2880" w:hanging="360"/>
+      </w:pPr>
+      <w:rPr>
+        <w:rFonts w:ascii="Wingdings" w:hAnsi="Wingdings" w:hint="default"/>
+        <w:sz w:val="20"/>
+      </w:rPr>
+    </w:lvl>
+    <w:lvl w:ilvl="4" w:tentative="1">
+      <w:start w:val="1"/>
+      <w:numFmt w:val="bullet"/>
+      <w:lvlText w:val=""/>
+      <w:lvlJc w:val="left"/>
+      <w:pPr>
+        <w:tabs>
+          <w:tab w:val="num" w:pos="3600"/>
+        </w:tabs>
+        <w:ind w:left="3600" w:hanging="360"/>
+      </w:pPr>
+      <w:rPr>
+        <w:rFonts w:ascii="Wingdings" w:hAnsi="Wingdings" w:hint="default"/>
+        <w:sz w:val="20"/>
+      </w:rPr>
+    </w:lvl>
+    <w:lvl w:ilvl="5" w:tentative="1">
+      <w:start w:val="1"/>
+      <w:numFmt w:val="bullet"/>
+      <w:lvlText w:val=""/>
+      <w:lvlJc w:val="left"/>
+      <w:pPr>
+        <w:tabs>
+          <w:tab w:val="num" w:pos="4320"/>
+        </w:tabs>
+        <w:ind w:left="4320" w:hanging="360"/>
+      </w:pPr>
+      <w:rPr>
+        <w:rFonts w:ascii="Wingdings" w:hAnsi="Wingdings" w:hint="default"/>
+        <w:sz w:val="20"/>
+      </w:rPr>
+    </w:lvl>
+    <w:lvl w:ilvl="6" w:tentative="1">
+      <w:start w:val="1"/>
+      <w:numFmt w:val="bullet"/>
+      <w:lvlText w:val=""/>
+      <w:lvlJc w:val="left"/>
+      <w:pPr>
+        <w:tabs>
+          <w:tab w:val="num" w:pos="5040"/>
+        </w:tabs>
+        <w:ind w:left="5040" w:hanging="360"/>
+      </w:pPr>
+      <w:rPr>
+        <w:rFonts w:ascii="Wingdings" w:hAnsi="Wingdings" w:hint="default"/>
+        <w:sz w:val="20"/>
+      </w:rPr>
+    </w:lvl>
+    <w:lvl w:ilvl="7" w:tentative="1">
+      <w:start w:val="1"/>
+      <w:numFmt w:val="bullet"/>
+      <w:lvlText w:val=""/>
+      <w:lvlJc w:val="left"/>
+      <w:pPr>
+        <w:tabs>
+          <w:tab w:val="num" w:pos="5760"/>
+        </w:tabs>
+        <w:ind w:left="5760" w:hanging="360"/>
+      </w:pPr>
+      <w:rPr>
+        <w:rFonts w:ascii="Wingdings" w:hAnsi="Wingdings" w:hint="default"/>
+        <w:sz w:val="20"/>
+      </w:rPr>
+    </w:lvl>
+    <w:lvl w:ilvl="8" w:tentative="1">
+      <w:start w:val="1"/>
+      <w:numFmt w:val="bullet"/>
+      <w:lvlText w:val=""/>
+      <w:lvlJc w:val="left"/>
+      <w:pPr>
+        <w:tabs>
+          <w:tab w:val="num" w:pos="6480"/>
+        </w:tabs>
+        <w:ind w:left="6480" w:hanging="360"/>
+      </w:pPr>
+      <w:rPr>
+        <w:rFonts w:ascii="Wingdings" w:hAnsi="Wingdings" w:hint="default"/>
+        <w:sz w:val="20"/>
+      </w:rPr>
+    </w:lvl>
+  </w:abstractNum>
+  <w:abstractNum w:abstractNumId="31" w15:restartNumberingAfterBreak="0">
     <w:nsid w:val="514E749D"/>
     <w:multiLevelType w:val="multilevel"/>
     <w:tmpl w:val="1C16BFB4"/>
@@ -4325,7 +7335,7 @@
       </w:pPr>
     </w:lvl>
   </w:abstractNum>
-  <w:abstractNum w:abstractNumId="26" w15:restartNumberingAfterBreak="0">
+  <w:abstractNum w:abstractNumId="32" w15:restartNumberingAfterBreak="0">
     <w:nsid w:val="56357515"/>
     <w:multiLevelType w:val="multilevel"/>
     <w:tmpl w:val="008414E4"/>
@@ -4474,7 +7484,7 @@
       </w:rPr>
     </w:lvl>
   </w:abstractNum>
-  <w:abstractNum w:abstractNumId="27" w15:restartNumberingAfterBreak="0">
+  <w:abstractNum w:abstractNumId="33" w15:restartNumberingAfterBreak="0">
     <w:nsid w:val="566E1090"/>
     <w:multiLevelType w:val="multilevel"/>
     <w:tmpl w:val="131437B6"/>
@@ -4623,7 +7633,7 @@
       </w:rPr>
     </w:lvl>
   </w:abstractNum>
-  <w:abstractNum w:abstractNumId="28" w15:restartNumberingAfterBreak="0">
+  <w:abstractNum w:abstractNumId="34" w15:restartNumberingAfterBreak="0">
     <w:nsid w:val="568856C6"/>
     <w:multiLevelType w:val="multilevel"/>
     <w:tmpl w:val="4EB03EA4"/>
@@ -4772,7 +7782,454 @@
       </w:rPr>
     </w:lvl>
   </w:abstractNum>
-  <w:abstractNum w:abstractNumId="29" w15:restartNumberingAfterBreak="0">
+  <w:abstractNum w:abstractNumId="35" w15:restartNumberingAfterBreak="0">
+    <w:nsid w:val="59211CEC"/>
+    <w:multiLevelType w:val="multilevel"/>
+    <w:tmpl w:val="8DEC1D24"/>
+    <w:lvl w:ilvl="0">
+      <w:start w:val="1"/>
+      <w:numFmt w:val="bullet"/>
+      <w:lvlText w:val=""/>
+      <w:lvlJc w:val="left"/>
+      <w:pPr>
+        <w:tabs>
+          <w:tab w:val="num" w:pos="720"/>
+        </w:tabs>
+        <w:ind w:left="720" w:hanging="360"/>
+      </w:pPr>
+      <w:rPr>
+        <w:rFonts w:ascii="Symbol" w:hAnsi="Symbol" w:hint="default"/>
+        <w:sz w:val="20"/>
+      </w:rPr>
+    </w:lvl>
+    <w:lvl w:ilvl="1" w:tentative="1">
+      <w:start w:val="1"/>
+      <w:numFmt w:val="bullet"/>
+      <w:lvlText w:val="o"/>
+      <w:lvlJc w:val="left"/>
+      <w:pPr>
+        <w:tabs>
+          <w:tab w:val="num" w:pos="1440"/>
+        </w:tabs>
+        <w:ind w:left="1440" w:hanging="360"/>
+      </w:pPr>
+      <w:rPr>
+        <w:rFonts w:ascii="Courier New" w:hAnsi="Courier New" w:hint="default"/>
+        <w:sz w:val="20"/>
+      </w:rPr>
+    </w:lvl>
+    <w:lvl w:ilvl="2" w:tentative="1">
+      <w:start w:val="1"/>
+      <w:numFmt w:val="bullet"/>
+      <w:lvlText w:val=""/>
+      <w:lvlJc w:val="left"/>
+      <w:pPr>
+        <w:tabs>
+          <w:tab w:val="num" w:pos="2160"/>
+        </w:tabs>
+        <w:ind w:left="2160" w:hanging="360"/>
+      </w:pPr>
+      <w:rPr>
+        <w:rFonts w:ascii="Wingdings" w:hAnsi="Wingdings" w:hint="default"/>
+        <w:sz w:val="20"/>
+      </w:rPr>
+    </w:lvl>
+    <w:lvl w:ilvl="3" w:tentative="1">
+      <w:start w:val="1"/>
+      <w:numFmt w:val="bullet"/>
+      <w:lvlText w:val=""/>
+      <w:lvlJc w:val="left"/>
+      <w:pPr>
+        <w:tabs>
+          <w:tab w:val="num" w:pos="2880"/>
+        </w:tabs>
+        <w:ind w:left="2880" w:hanging="360"/>
+      </w:pPr>
+      <w:rPr>
+        <w:rFonts w:ascii="Wingdings" w:hAnsi="Wingdings" w:hint="default"/>
+        <w:sz w:val="20"/>
+      </w:rPr>
+    </w:lvl>
+    <w:lvl w:ilvl="4" w:tentative="1">
+      <w:start w:val="1"/>
+      <w:numFmt w:val="bullet"/>
+      <w:lvlText w:val=""/>
+      <w:lvlJc w:val="left"/>
+      <w:pPr>
+        <w:tabs>
+          <w:tab w:val="num" w:pos="3600"/>
+        </w:tabs>
+        <w:ind w:left="3600" w:hanging="360"/>
+      </w:pPr>
+      <w:rPr>
+        <w:rFonts w:ascii="Wingdings" w:hAnsi="Wingdings" w:hint="default"/>
+        <w:sz w:val="20"/>
+      </w:rPr>
+    </w:lvl>
+    <w:lvl w:ilvl="5" w:tentative="1">
+      <w:start w:val="1"/>
+      <w:numFmt w:val="bullet"/>
+      <w:lvlText w:val=""/>
+      <w:lvlJc w:val="left"/>
+      <w:pPr>
+        <w:tabs>
+          <w:tab w:val="num" w:pos="4320"/>
+        </w:tabs>
+        <w:ind w:left="4320" w:hanging="360"/>
+      </w:pPr>
+      <w:rPr>
+        <w:rFonts w:ascii="Wingdings" w:hAnsi="Wingdings" w:hint="default"/>
+        <w:sz w:val="20"/>
+      </w:rPr>
+    </w:lvl>
+    <w:lvl w:ilvl="6" w:tentative="1">
+      <w:start w:val="1"/>
+      <w:numFmt w:val="bullet"/>
+      <w:lvlText w:val=""/>
+      <w:lvlJc w:val="left"/>
+      <w:pPr>
+        <w:tabs>
+          <w:tab w:val="num" w:pos="5040"/>
+        </w:tabs>
+        <w:ind w:left="5040" w:hanging="360"/>
+      </w:pPr>
+      <w:rPr>
+        <w:rFonts w:ascii="Wingdings" w:hAnsi="Wingdings" w:hint="default"/>
+        <w:sz w:val="20"/>
+      </w:rPr>
+    </w:lvl>
+    <w:lvl w:ilvl="7" w:tentative="1">
+      <w:start w:val="1"/>
+      <w:numFmt w:val="bullet"/>
+      <w:lvlText w:val=""/>
+      <w:lvlJc w:val="left"/>
+      <w:pPr>
+        <w:tabs>
+          <w:tab w:val="num" w:pos="5760"/>
+        </w:tabs>
+        <w:ind w:left="5760" w:hanging="360"/>
+      </w:pPr>
+      <w:rPr>
+        <w:rFonts w:ascii="Wingdings" w:hAnsi="Wingdings" w:hint="default"/>
+        <w:sz w:val="20"/>
+      </w:rPr>
+    </w:lvl>
+    <w:lvl w:ilvl="8" w:tentative="1">
+      <w:start w:val="1"/>
+      <w:numFmt w:val="bullet"/>
+      <w:lvlText w:val=""/>
+      <w:lvlJc w:val="left"/>
+      <w:pPr>
+        <w:tabs>
+          <w:tab w:val="num" w:pos="6480"/>
+        </w:tabs>
+        <w:ind w:left="6480" w:hanging="360"/>
+      </w:pPr>
+      <w:rPr>
+        <w:rFonts w:ascii="Wingdings" w:hAnsi="Wingdings" w:hint="default"/>
+        <w:sz w:val="20"/>
+      </w:rPr>
+    </w:lvl>
+  </w:abstractNum>
+  <w:abstractNum w:abstractNumId="36" w15:restartNumberingAfterBreak="0">
+    <w:nsid w:val="684A3858"/>
+    <w:multiLevelType w:val="multilevel"/>
+    <w:tmpl w:val="A26A6082"/>
+    <w:lvl w:ilvl="0">
+      <w:start w:val="1"/>
+      <w:numFmt w:val="bullet"/>
+      <w:lvlText w:val=""/>
+      <w:lvlJc w:val="left"/>
+      <w:pPr>
+        <w:tabs>
+          <w:tab w:val="num" w:pos="720"/>
+        </w:tabs>
+        <w:ind w:left="720" w:hanging="360"/>
+      </w:pPr>
+      <w:rPr>
+        <w:rFonts w:ascii="Symbol" w:hAnsi="Symbol" w:hint="default"/>
+        <w:sz w:val="20"/>
+      </w:rPr>
+    </w:lvl>
+    <w:lvl w:ilvl="1" w:tentative="1">
+      <w:start w:val="1"/>
+      <w:numFmt w:val="bullet"/>
+      <w:lvlText w:val="o"/>
+      <w:lvlJc w:val="left"/>
+      <w:pPr>
+        <w:tabs>
+          <w:tab w:val="num" w:pos="1440"/>
+        </w:tabs>
+        <w:ind w:left="1440" w:hanging="360"/>
+      </w:pPr>
+      <w:rPr>
+        <w:rFonts w:ascii="Courier New" w:hAnsi="Courier New" w:hint="default"/>
+        <w:sz w:val="20"/>
+      </w:rPr>
+    </w:lvl>
+    <w:lvl w:ilvl="2" w:tentative="1">
+      <w:start w:val="1"/>
+      <w:numFmt w:val="bullet"/>
+      <w:lvlText w:val=""/>
+      <w:lvlJc w:val="left"/>
+      <w:pPr>
+        <w:tabs>
+          <w:tab w:val="num" w:pos="2160"/>
+        </w:tabs>
+        <w:ind w:left="2160" w:hanging="360"/>
+      </w:pPr>
+      <w:rPr>
+        <w:rFonts w:ascii="Wingdings" w:hAnsi="Wingdings" w:hint="default"/>
+        <w:sz w:val="20"/>
+      </w:rPr>
+    </w:lvl>
+    <w:lvl w:ilvl="3" w:tentative="1">
+      <w:start w:val="1"/>
+      <w:numFmt w:val="bullet"/>
+      <w:lvlText w:val=""/>
+      <w:lvlJc w:val="left"/>
+      <w:pPr>
+        <w:tabs>
+          <w:tab w:val="num" w:pos="2880"/>
+        </w:tabs>
+        <w:ind w:left="2880" w:hanging="360"/>
+      </w:pPr>
+      <w:rPr>
+        <w:rFonts w:ascii="Wingdings" w:hAnsi="Wingdings" w:hint="default"/>
+        <w:sz w:val="20"/>
+      </w:rPr>
+    </w:lvl>
+    <w:lvl w:ilvl="4" w:tentative="1">
+      <w:start w:val="1"/>
+      <w:numFmt w:val="bullet"/>
+      <w:lvlText w:val=""/>
+      <w:lvlJc w:val="left"/>
+      <w:pPr>
+        <w:tabs>
+          <w:tab w:val="num" w:pos="3600"/>
+        </w:tabs>
+        <w:ind w:left="3600" w:hanging="360"/>
+      </w:pPr>
+      <w:rPr>
+        <w:rFonts w:ascii="Wingdings" w:hAnsi="Wingdings" w:hint="default"/>
+        <w:sz w:val="20"/>
+      </w:rPr>
+    </w:lvl>
+    <w:lvl w:ilvl="5" w:tentative="1">
+      <w:start w:val="1"/>
+      <w:numFmt w:val="bullet"/>
+      <w:lvlText w:val=""/>
+      <w:lvlJc w:val="left"/>
+      <w:pPr>
+        <w:tabs>
+          <w:tab w:val="num" w:pos="4320"/>
+        </w:tabs>
+        <w:ind w:left="4320" w:hanging="360"/>
+      </w:pPr>
+      <w:rPr>
+        <w:rFonts w:ascii="Wingdings" w:hAnsi="Wingdings" w:hint="default"/>
+        <w:sz w:val="20"/>
+      </w:rPr>
+    </w:lvl>
+    <w:lvl w:ilvl="6" w:tentative="1">
+      <w:start w:val="1"/>
+      <w:numFmt w:val="bullet"/>
+      <w:lvlText w:val=""/>
+      <w:lvlJc w:val="left"/>
+      <w:pPr>
+        <w:tabs>
+          <w:tab w:val="num" w:pos="5040"/>
+        </w:tabs>
+        <w:ind w:left="5040" w:hanging="360"/>
+      </w:pPr>
+      <w:rPr>
+        <w:rFonts w:ascii="Wingdings" w:hAnsi="Wingdings" w:hint="default"/>
+        <w:sz w:val="20"/>
+      </w:rPr>
+    </w:lvl>
+    <w:lvl w:ilvl="7" w:tentative="1">
+      <w:start w:val="1"/>
+      <w:numFmt w:val="bullet"/>
+      <w:lvlText w:val=""/>
+      <w:lvlJc w:val="left"/>
+      <w:pPr>
+        <w:tabs>
+          <w:tab w:val="num" w:pos="5760"/>
+        </w:tabs>
+        <w:ind w:left="5760" w:hanging="360"/>
+      </w:pPr>
+      <w:rPr>
+        <w:rFonts w:ascii="Wingdings" w:hAnsi="Wingdings" w:hint="default"/>
+        <w:sz w:val="20"/>
+      </w:rPr>
+    </w:lvl>
+    <w:lvl w:ilvl="8" w:tentative="1">
+      <w:start w:val="1"/>
+      <w:numFmt w:val="bullet"/>
+      <w:lvlText w:val=""/>
+      <w:lvlJc w:val="left"/>
+      <w:pPr>
+        <w:tabs>
+          <w:tab w:val="num" w:pos="6480"/>
+        </w:tabs>
+        <w:ind w:left="6480" w:hanging="360"/>
+      </w:pPr>
+      <w:rPr>
+        <w:rFonts w:ascii="Wingdings" w:hAnsi="Wingdings" w:hint="default"/>
+        <w:sz w:val="20"/>
+      </w:rPr>
+    </w:lvl>
+  </w:abstractNum>
+  <w:abstractNum w:abstractNumId="37" w15:restartNumberingAfterBreak="0">
+    <w:nsid w:val="69292A0C"/>
+    <w:multiLevelType w:val="multilevel"/>
+    <w:tmpl w:val="96BC2B6C"/>
+    <w:lvl w:ilvl="0">
+      <w:start w:val="1"/>
+      <w:numFmt w:val="bullet"/>
+      <w:lvlText w:val=""/>
+      <w:lvlJc w:val="left"/>
+      <w:pPr>
+        <w:tabs>
+          <w:tab w:val="num" w:pos="720"/>
+        </w:tabs>
+        <w:ind w:left="720" w:hanging="360"/>
+      </w:pPr>
+      <w:rPr>
+        <w:rFonts w:ascii="Symbol" w:hAnsi="Symbol" w:hint="default"/>
+        <w:sz w:val="20"/>
+      </w:rPr>
+    </w:lvl>
+    <w:lvl w:ilvl="1" w:tentative="1">
+      <w:start w:val="1"/>
+      <w:numFmt w:val="bullet"/>
+      <w:lvlText w:val="o"/>
+      <w:lvlJc w:val="left"/>
+      <w:pPr>
+        <w:tabs>
+          <w:tab w:val="num" w:pos="1440"/>
+        </w:tabs>
+        <w:ind w:left="1440" w:hanging="360"/>
+      </w:pPr>
+      <w:rPr>
+        <w:rFonts w:ascii="Courier New" w:hAnsi="Courier New" w:hint="default"/>
+        <w:sz w:val="20"/>
+      </w:rPr>
+    </w:lvl>
+    <w:lvl w:ilvl="2" w:tentative="1">
+      <w:start w:val="1"/>
+      <w:numFmt w:val="bullet"/>
+      <w:lvlText w:val=""/>
+      <w:lvlJc w:val="left"/>
+      <w:pPr>
+        <w:tabs>
+          <w:tab w:val="num" w:pos="2160"/>
+        </w:tabs>
+        <w:ind w:left="2160" w:hanging="360"/>
+      </w:pPr>
+      <w:rPr>
+        <w:rFonts w:ascii="Wingdings" w:hAnsi="Wingdings" w:hint="default"/>
+        <w:sz w:val="20"/>
+      </w:rPr>
+    </w:lvl>
+    <w:lvl w:ilvl="3" w:tentative="1">
+      <w:start w:val="1"/>
+      <w:numFmt w:val="bullet"/>
+      <w:lvlText w:val=""/>
+      <w:lvlJc w:val="left"/>
+      <w:pPr>
+        <w:tabs>
+          <w:tab w:val="num" w:pos="2880"/>
+        </w:tabs>
+        <w:ind w:left="2880" w:hanging="360"/>
+      </w:pPr>
+      <w:rPr>
+        <w:rFonts w:ascii="Wingdings" w:hAnsi="Wingdings" w:hint="default"/>
+        <w:sz w:val="20"/>
+      </w:rPr>
+    </w:lvl>
+    <w:lvl w:ilvl="4" w:tentative="1">
+      <w:start w:val="1"/>
+      <w:numFmt w:val="bullet"/>
+      <w:lvlText w:val=""/>
+      <w:lvlJc w:val="left"/>
+      <w:pPr>
+        <w:tabs>
+          <w:tab w:val="num" w:pos="3600"/>
+        </w:tabs>
+        <w:ind w:left="3600" w:hanging="360"/>
+      </w:pPr>
+      <w:rPr>
+        <w:rFonts w:ascii="Wingdings" w:hAnsi="Wingdings" w:hint="default"/>
+        <w:sz w:val="20"/>
+      </w:rPr>
+    </w:lvl>
+    <w:lvl w:ilvl="5" w:tentative="1">
+      <w:start w:val="1"/>
+      <w:numFmt w:val="bullet"/>
+      <w:lvlText w:val=""/>
+      <w:lvlJc w:val="left"/>
+      <w:pPr>
+        <w:tabs>
+          <w:tab w:val="num" w:pos="4320"/>
+        </w:tabs>
+        <w:ind w:left="4320" w:hanging="360"/>
+      </w:pPr>
+      <w:rPr>
+        <w:rFonts w:ascii="Wingdings" w:hAnsi="Wingdings" w:hint="default"/>
+        <w:sz w:val="20"/>
+      </w:rPr>
+    </w:lvl>
+    <w:lvl w:ilvl="6" w:tentative="1">
+      <w:start w:val="1"/>
+      <w:numFmt w:val="bullet"/>
+      <w:lvlText w:val=""/>
+      <w:lvlJc w:val="left"/>
+      <w:pPr>
+        <w:tabs>
+          <w:tab w:val="num" w:pos="5040"/>
+        </w:tabs>
+        <w:ind w:left="5040" w:hanging="360"/>
+      </w:pPr>
+      <w:rPr>
+        <w:rFonts w:ascii="Wingdings" w:hAnsi="Wingdings" w:hint="default"/>
+        <w:sz w:val="20"/>
+      </w:rPr>
+    </w:lvl>
+    <w:lvl w:ilvl="7" w:tentative="1">
+      <w:start w:val="1"/>
+      <w:numFmt w:val="bullet"/>
+      <w:lvlText w:val=""/>
+      <w:lvlJc w:val="left"/>
+      <w:pPr>
+        <w:tabs>
+          <w:tab w:val="num" w:pos="5760"/>
+        </w:tabs>
+        <w:ind w:left="5760" w:hanging="360"/>
+      </w:pPr>
+      <w:rPr>
+        <w:rFonts w:ascii="Wingdings" w:hAnsi="Wingdings" w:hint="default"/>
+        <w:sz w:val="20"/>
+      </w:rPr>
+    </w:lvl>
+    <w:lvl w:ilvl="8" w:tentative="1">
+      <w:start w:val="1"/>
+      <w:numFmt w:val="bullet"/>
+      <w:lvlText w:val=""/>
+      <w:lvlJc w:val="left"/>
+      <w:pPr>
+        <w:tabs>
+          <w:tab w:val="num" w:pos="6480"/>
+        </w:tabs>
+        <w:ind w:left="6480" w:hanging="360"/>
+      </w:pPr>
+      <w:rPr>
+        <w:rFonts w:ascii="Wingdings" w:hAnsi="Wingdings" w:hint="default"/>
+        <w:sz w:val="20"/>
+      </w:rPr>
+    </w:lvl>
+  </w:abstractNum>
+  <w:abstractNum w:abstractNumId="38" w15:restartNumberingAfterBreak="0">
     <w:nsid w:val="6B7D5CE3"/>
     <w:multiLevelType w:val="multilevel"/>
     <w:tmpl w:val="60E49F5A"/>
@@ -4921,7 +8378,7 @@
       </w:rPr>
     </w:lvl>
   </w:abstractNum>
-  <w:abstractNum w:abstractNumId="30" w15:restartNumberingAfterBreak="0">
+  <w:abstractNum w:abstractNumId="39" w15:restartNumberingAfterBreak="0">
     <w:nsid w:val="6BB66544"/>
     <w:multiLevelType w:val="multilevel"/>
     <w:tmpl w:val="4318805C"/>
@@ -5038,7 +8495,7 @@
       </w:pPr>
     </w:lvl>
   </w:abstractNum>
-  <w:abstractNum w:abstractNumId="31" w15:restartNumberingAfterBreak="0">
+  <w:abstractNum w:abstractNumId="40" w15:restartNumberingAfterBreak="0">
     <w:nsid w:val="6DF764E1"/>
     <w:multiLevelType w:val="multilevel"/>
     <w:tmpl w:val="CA1C12D4"/>
@@ -5155,7 +8612,7 @@
       </w:pPr>
     </w:lvl>
   </w:abstractNum>
-  <w:abstractNum w:abstractNumId="32" w15:restartNumberingAfterBreak="0">
+  <w:abstractNum w:abstractNumId="41" w15:restartNumberingAfterBreak="0">
     <w:nsid w:val="74717523"/>
     <w:multiLevelType w:val="multilevel"/>
     <w:tmpl w:val="33ACD430"/>
@@ -5304,7 +8761,7 @@
       </w:rPr>
     </w:lvl>
   </w:abstractNum>
-  <w:abstractNum w:abstractNumId="33" w15:restartNumberingAfterBreak="0">
+  <w:abstractNum w:abstractNumId="42" w15:restartNumberingAfterBreak="0">
     <w:nsid w:val="760D185A"/>
     <w:multiLevelType w:val="multilevel"/>
     <w:tmpl w:val="E97C0124"/>
@@ -5417,7 +8874,7 @@
       </w:pPr>
     </w:lvl>
   </w:abstractNum>
-  <w:abstractNum w:abstractNumId="34" w15:restartNumberingAfterBreak="0">
+  <w:abstractNum w:abstractNumId="43" w15:restartNumberingAfterBreak="0">
     <w:nsid w:val="770C4BC9"/>
     <w:multiLevelType w:val="multilevel"/>
     <w:tmpl w:val="3990D6C4"/>
@@ -5566,7 +9023,7 @@
       </w:rPr>
     </w:lvl>
   </w:abstractNum>
-  <w:abstractNum w:abstractNumId="35" w15:restartNumberingAfterBreak="0">
+  <w:abstractNum w:abstractNumId="44" w15:restartNumberingAfterBreak="0">
     <w:nsid w:val="7928444D"/>
     <w:multiLevelType w:val="multilevel"/>
     <w:tmpl w:val="F88C96C4"/>
@@ -5715,113 +9172,292 @@
       </w:rPr>
     </w:lvl>
   </w:abstractNum>
+  <w:abstractNum w:abstractNumId="45" w15:restartNumberingAfterBreak="0">
+    <w:nsid w:val="7B2A586A"/>
+    <w:multiLevelType w:val="multilevel"/>
+    <w:tmpl w:val="24FE7BF2"/>
+    <w:lvl w:ilvl="0">
+      <w:start w:val="1"/>
+      <w:numFmt w:val="bullet"/>
+      <w:lvlText w:val=""/>
+      <w:lvlJc w:val="left"/>
+      <w:pPr>
+        <w:tabs>
+          <w:tab w:val="num" w:pos="720"/>
+        </w:tabs>
+        <w:ind w:left="720" w:hanging="360"/>
+      </w:pPr>
+      <w:rPr>
+        <w:rFonts w:ascii="Symbol" w:hAnsi="Symbol" w:hint="default"/>
+        <w:sz w:val="20"/>
+      </w:rPr>
+    </w:lvl>
+    <w:lvl w:ilvl="1">
+      <w:start w:val="1"/>
+      <w:numFmt w:val="bullet"/>
+      <w:lvlText w:val="o"/>
+      <w:lvlJc w:val="left"/>
+      <w:pPr>
+        <w:tabs>
+          <w:tab w:val="num" w:pos="1440"/>
+        </w:tabs>
+        <w:ind w:left="1440" w:hanging="360"/>
+      </w:pPr>
+      <w:rPr>
+        <w:rFonts w:ascii="Courier New" w:hAnsi="Courier New" w:hint="default"/>
+        <w:sz w:val="20"/>
+      </w:rPr>
+    </w:lvl>
+    <w:lvl w:ilvl="2" w:tentative="1">
+      <w:start w:val="1"/>
+      <w:numFmt w:val="bullet"/>
+      <w:lvlText w:val=""/>
+      <w:lvlJc w:val="left"/>
+      <w:pPr>
+        <w:tabs>
+          <w:tab w:val="num" w:pos="2160"/>
+        </w:tabs>
+        <w:ind w:left="2160" w:hanging="360"/>
+      </w:pPr>
+      <w:rPr>
+        <w:rFonts w:ascii="Wingdings" w:hAnsi="Wingdings" w:hint="default"/>
+        <w:sz w:val="20"/>
+      </w:rPr>
+    </w:lvl>
+    <w:lvl w:ilvl="3" w:tentative="1">
+      <w:start w:val="1"/>
+      <w:numFmt w:val="bullet"/>
+      <w:lvlText w:val=""/>
+      <w:lvlJc w:val="left"/>
+      <w:pPr>
+        <w:tabs>
+          <w:tab w:val="num" w:pos="2880"/>
+        </w:tabs>
+        <w:ind w:left="2880" w:hanging="360"/>
+      </w:pPr>
+      <w:rPr>
+        <w:rFonts w:ascii="Wingdings" w:hAnsi="Wingdings" w:hint="default"/>
+        <w:sz w:val="20"/>
+      </w:rPr>
+    </w:lvl>
+    <w:lvl w:ilvl="4" w:tentative="1">
+      <w:start w:val="1"/>
+      <w:numFmt w:val="bullet"/>
+      <w:lvlText w:val=""/>
+      <w:lvlJc w:val="left"/>
+      <w:pPr>
+        <w:tabs>
+          <w:tab w:val="num" w:pos="3600"/>
+        </w:tabs>
+        <w:ind w:left="3600" w:hanging="360"/>
+      </w:pPr>
+      <w:rPr>
+        <w:rFonts w:ascii="Wingdings" w:hAnsi="Wingdings" w:hint="default"/>
+        <w:sz w:val="20"/>
+      </w:rPr>
+    </w:lvl>
+    <w:lvl w:ilvl="5" w:tentative="1">
+      <w:start w:val="1"/>
+      <w:numFmt w:val="bullet"/>
+      <w:lvlText w:val=""/>
+      <w:lvlJc w:val="left"/>
+      <w:pPr>
+        <w:tabs>
+          <w:tab w:val="num" w:pos="4320"/>
+        </w:tabs>
+        <w:ind w:left="4320" w:hanging="360"/>
+      </w:pPr>
+      <w:rPr>
+        <w:rFonts w:ascii="Wingdings" w:hAnsi="Wingdings" w:hint="default"/>
+        <w:sz w:val="20"/>
+      </w:rPr>
+    </w:lvl>
+    <w:lvl w:ilvl="6" w:tentative="1">
+      <w:start w:val="1"/>
+      <w:numFmt w:val="bullet"/>
+      <w:lvlText w:val=""/>
+      <w:lvlJc w:val="left"/>
+      <w:pPr>
+        <w:tabs>
+          <w:tab w:val="num" w:pos="5040"/>
+        </w:tabs>
+        <w:ind w:left="5040" w:hanging="360"/>
+      </w:pPr>
+      <w:rPr>
+        <w:rFonts w:ascii="Wingdings" w:hAnsi="Wingdings" w:hint="default"/>
+        <w:sz w:val="20"/>
+      </w:rPr>
+    </w:lvl>
+    <w:lvl w:ilvl="7" w:tentative="1">
+      <w:start w:val="1"/>
+      <w:numFmt w:val="bullet"/>
+      <w:lvlText w:val=""/>
+      <w:lvlJc w:val="left"/>
+      <w:pPr>
+        <w:tabs>
+          <w:tab w:val="num" w:pos="5760"/>
+        </w:tabs>
+        <w:ind w:left="5760" w:hanging="360"/>
+      </w:pPr>
+      <w:rPr>
+        <w:rFonts w:ascii="Wingdings" w:hAnsi="Wingdings" w:hint="default"/>
+        <w:sz w:val="20"/>
+      </w:rPr>
+    </w:lvl>
+    <w:lvl w:ilvl="8" w:tentative="1">
+      <w:start w:val="1"/>
+      <w:numFmt w:val="bullet"/>
+      <w:lvlText w:val=""/>
+      <w:lvlJc w:val="left"/>
+      <w:pPr>
+        <w:tabs>
+          <w:tab w:val="num" w:pos="6480"/>
+        </w:tabs>
+        <w:ind w:left="6480" w:hanging="360"/>
+      </w:pPr>
+      <w:rPr>
+        <w:rFonts w:ascii="Wingdings" w:hAnsi="Wingdings" w:hint="default"/>
+        <w:sz w:val="20"/>
+      </w:rPr>
+    </w:lvl>
+  </w:abstractNum>
   <w:num w:numId="1" w16cid:durableId="1649244922">
-    <w:abstractNumId w:val="19"/>
+    <w:abstractNumId w:val="23"/>
   </w:num>
   <w:num w:numId="2" w16cid:durableId="2071267873">
-    <w:abstractNumId w:val="12"/>
+    <w:abstractNumId w:val="16"/>
   </w:num>
   <w:num w:numId="3" w16cid:durableId="1654988784">
-    <w:abstractNumId w:val="20"/>
+    <w:abstractNumId w:val="24"/>
   </w:num>
   <w:num w:numId="4" w16cid:durableId="1114835507">
-    <w:abstractNumId w:val="35"/>
+    <w:abstractNumId w:val="44"/>
   </w:num>
   <w:num w:numId="5" w16cid:durableId="1727561296">
-    <w:abstractNumId w:val="34"/>
+    <w:abstractNumId w:val="43"/>
   </w:num>
   <w:num w:numId="6" w16cid:durableId="367728227">
-    <w:abstractNumId w:val="7"/>
+    <w:abstractNumId w:val="11"/>
   </w:num>
   <w:num w:numId="7" w16cid:durableId="545483306">
-    <w:abstractNumId w:val="33"/>
+    <w:abstractNumId w:val="42"/>
   </w:num>
   <w:num w:numId="8" w16cid:durableId="1509061742">
-    <w:abstractNumId w:val="15"/>
+    <w:abstractNumId w:val="19"/>
   </w:num>
   <w:num w:numId="9" w16cid:durableId="758916379">
     <w:abstractNumId w:val="1"/>
   </w:num>
   <w:num w:numId="10" w16cid:durableId="1260673338">
-    <w:abstractNumId w:val="27"/>
+    <w:abstractNumId w:val="33"/>
   </w:num>
   <w:num w:numId="11" w16cid:durableId="67269083">
+    <w:abstractNumId w:val="31"/>
+  </w:num>
+  <w:num w:numId="12" w16cid:durableId="933368110">
+    <w:abstractNumId w:val="18"/>
+  </w:num>
+  <w:num w:numId="13" w16cid:durableId="1021591697">
+    <w:abstractNumId w:val="34"/>
+  </w:num>
+  <w:num w:numId="14" w16cid:durableId="872035137">
     <w:abstractNumId w:val="25"/>
   </w:num>
-  <w:num w:numId="12" w16cid:durableId="933368110">
+  <w:num w:numId="15" w16cid:durableId="2064325988">
+    <w:abstractNumId w:val="4"/>
+  </w:num>
+  <w:num w:numId="16" w16cid:durableId="1623733165">
+    <w:abstractNumId w:val="20"/>
+  </w:num>
+  <w:num w:numId="17" w16cid:durableId="1839688044">
+    <w:abstractNumId w:val="22"/>
+  </w:num>
+  <w:num w:numId="18" w16cid:durableId="1637372428">
     <w:abstractNumId w:val="14"/>
   </w:num>
-  <w:num w:numId="13" w16cid:durableId="1021591697">
-    <w:abstractNumId w:val="28"/>
-  </w:num>
-  <w:num w:numId="14" w16cid:durableId="872035137">
-    <w:abstractNumId w:val="21"/>
-  </w:num>
-  <w:num w:numId="15" w16cid:durableId="2064325988">
-    <w:abstractNumId w:val="3"/>
-  </w:num>
-  <w:num w:numId="16" w16cid:durableId="1623733165">
-    <w:abstractNumId w:val="16"/>
-  </w:num>
-  <w:num w:numId="17" w16cid:durableId="1839688044">
-    <w:abstractNumId w:val="18"/>
-  </w:num>
-  <w:num w:numId="18" w16cid:durableId="1637372428">
-    <w:abstractNumId w:val="10"/>
-  </w:num>
   <w:num w:numId="19" w16cid:durableId="1633704154">
-    <w:abstractNumId w:val="4"/>
+    <w:abstractNumId w:val="6"/>
   </w:num>
   <w:num w:numId="20" w16cid:durableId="1665744683">
-    <w:abstractNumId w:val="30"/>
+    <w:abstractNumId w:val="39"/>
   </w:num>
   <w:num w:numId="21" w16cid:durableId="542787543">
-    <w:abstractNumId w:val="6"/>
+    <w:abstractNumId w:val="8"/>
   </w:num>
   <w:num w:numId="22" w16cid:durableId="1804687159">
-    <w:abstractNumId w:val="26"/>
+    <w:abstractNumId w:val="32"/>
   </w:num>
   <w:num w:numId="23" w16cid:durableId="395668434">
-    <w:abstractNumId w:val="9"/>
+    <w:abstractNumId w:val="13"/>
   </w:num>
   <w:num w:numId="24" w16cid:durableId="2045399338">
-    <w:abstractNumId w:val="13"/>
+    <w:abstractNumId w:val="17"/>
   </w:num>
   <w:num w:numId="25" w16cid:durableId="508719770">
     <w:abstractNumId w:val="0"/>
   </w:num>
   <w:num w:numId="26" w16cid:durableId="1280798846">
-    <w:abstractNumId w:val="24"/>
+    <w:abstractNumId w:val="29"/>
   </w:num>
   <w:num w:numId="27" w16cid:durableId="1468089472">
-    <w:abstractNumId w:val="32"/>
+    <w:abstractNumId w:val="41"/>
   </w:num>
   <w:num w:numId="28" w16cid:durableId="1534152908">
-    <w:abstractNumId w:val="11"/>
+    <w:abstractNumId w:val="15"/>
   </w:num>
   <w:num w:numId="29" w16cid:durableId="1673490874">
-    <w:abstractNumId w:val="31"/>
+    <w:abstractNumId w:val="40"/>
   </w:num>
   <w:num w:numId="30" w16cid:durableId="1080518115">
-    <w:abstractNumId w:val="22"/>
+    <w:abstractNumId w:val="26"/>
   </w:num>
   <w:num w:numId="31" w16cid:durableId="731271325">
+    <w:abstractNumId w:val="3"/>
+  </w:num>
+  <w:num w:numId="32" w16cid:durableId="1746874752">
+    <w:abstractNumId w:val="38"/>
+  </w:num>
+  <w:num w:numId="33" w16cid:durableId="561907328">
+    <w:abstractNumId w:val="21"/>
+  </w:num>
+  <w:num w:numId="34" w16cid:durableId="542715833">
+    <w:abstractNumId w:val="12"/>
+  </w:num>
+  <w:num w:numId="35" w16cid:durableId="86583119">
+    <w:abstractNumId w:val="7"/>
+  </w:num>
+  <w:num w:numId="36" w16cid:durableId="891617293">
+    <w:abstractNumId w:val="27"/>
+  </w:num>
+  <w:num w:numId="37" w16cid:durableId="1241335161">
+    <w:abstractNumId w:val="28"/>
+  </w:num>
+  <w:num w:numId="38" w16cid:durableId="900674086">
+    <w:abstractNumId w:val="5"/>
+  </w:num>
+  <w:num w:numId="39" w16cid:durableId="565452775">
+    <w:abstractNumId w:val="9"/>
+  </w:num>
+  <w:num w:numId="40" w16cid:durableId="467283869">
+    <w:abstractNumId w:val="10"/>
+  </w:num>
+  <w:num w:numId="41" w16cid:durableId="179785652">
+    <w:abstractNumId w:val="37"/>
+  </w:num>
+  <w:num w:numId="42" w16cid:durableId="1220170756">
     <w:abstractNumId w:val="2"/>
   </w:num>
-  <w:num w:numId="32" w16cid:durableId="1746874752">
-    <w:abstractNumId w:val="29"/>
+  <w:num w:numId="43" w16cid:durableId="2005433502">
+    <w:abstractNumId w:val="36"/>
   </w:num>
-  <w:num w:numId="33" w16cid:durableId="561907328">
-    <w:abstractNumId w:val="17"/>
+  <w:num w:numId="44" w16cid:durableId="1106195140">
+    <w:abstractNumId w:val="45"/>
   </w:num>
-  <w:num w:numId="34" w16cid:durableId="542715833">
-    <w:abstractNumId w:val="8"/>
+  <w:num w:numId="45" w16cid:durableId="833302752">
+    <w:abstractNumId w:val="35"/>
   </w:num>
-  <w:num w:numId="35" w16cid:durableId="86583119">
-    <w:abstractNumId w:val="5"/>
-  </w:num>
-  <w:num w:numId="36" w16cid:durableId="891617293">
-    <w:abstractNumId w:val="23"/>
+  <w:num w:numId="46" w16cid:durableId="537356218">
+    <w:abstractNumId w:val="30"/>
   </w:num>
 </w:numbering>
 </file>
@@ -6282,7 +9918,6 @@
     <w:next w:val="Normal"/>
     <w:link w:val="Heading3Char"/>
     <w:uiPriority w:val="9"/>
-    <w:semiHidden/>
     <w:unhideWhenUsed/>
     <w:qFormat/>
     <w:rsid w:val="00687691"/>
@@ -6490,7 +10125,6 @@
     <w:basedOn w:val="DefaultParagraphFont"/>
     <w:link w:val="Heading3"/>
     <w:uiPriority w:val="9"/>
-    <w:semiHidden/>
     <w:rsid w:val="00687691"/>
     <w:rPr>
       <w:caps/>

</xml_diff>